<commit_message>
Made initial rev of Producer Consumer
Should be fine, needs additional cleanup:
-Make proper comments not TODO nots
-Double check requirements from assignment
-Make sure that it works with changes
-Make it easier to read messages
</commit_message>
<xml_diff>
--- a/Part 2 Additional Documentation.docx
+++ b/Part 2 Additional Documentation.docx
@@ -291,6 +291,12 @@
         <w:rPr>
           <w:color w:val="EE0000"/>
         </w:rPr>
+        <w:t xml:space="preserve">TODO1: </w:t>
+      </w:r>
+      <w:r>
+        <w:rPr>
+          <w:color w:val="EE0000"/>
+        </w:rPr>
         <w:t>Use the queue as the buffer used to store and retrieve items. Use FIFO queuing. You can assume any reasonable type (float, string, mixed types, ... but stay consistent) for the items.</w:t>
       </w:r>
     </w:p>
@@ -308,6 +314,24 @@
         <w:rPr>
           <w:color w:val="EE0000"/>
         </w:rPr>
+        <w:t>TODO</w:t>
+      </w:r>
+      <w:r>
+        <w:rPr>
+          <w:color w:val="EE0000"/>
+        </w:rPr>
+        <w:t>2</w:t>
+      </w:r>
+      <w:r>
+        <w:rPr>
+          <w:color w:val="EE0000"/>
+        </w:rPr>
+        <w:t xml:space="preserve">: </w:t>
+      </w:r>
+      <w:r>
+        <w:rPr>
+          <w:color w:val="EE0000"/>
+        </w:rPr>
         <w:t>Do not use any other synchronization primitive (lock, semaphore, ...), or buffering structure (circular buffer, ...).</w:t>
       </w:r>
     </w:p>
@@ -325,6 +349,24 @@
         <w:rPr>
           <w:color w:val="EE0000"/>
         </w:rPr>
+        <w:t>TODO</w:t>
+      </w:r>
+      <w:r>
+        <w:rPr>
+          <w:color w:val="EE0000"/>
+        </w:rPr>
+        <w:t>3</w:t>
+      </w:r>
+      <w:r>
+        <w:rPr>
+          <w:color w:val="EE0000"/>
+        </w:rPr>
+        <w:t xml:space="preserve">: </w:t>
+      </w:r>
+      <w:r>
+        <w:rPr>
+          <w:color w:val="EE0000"/>
+        </w:rPr>
         <w:t>Do not include any other import other than the ones in the skeleton code.</w:t>
       </w:r>
     </w:p>
@@ -342,6 +384,24 @@
         <w:rPr>
           <w:color w:val="EE0000"/>
         </w:rPr>
+        <w:t>TODO</w:t>
+      </w:r>
+      <w:r>
+        <w:rPr>
+          <w:color w:val="EE0000"/>
+        </w:rPr>
+        <w:t>4</w:t>
+      </w:r>
+      <w:r>
+        <w:rPr>
+          <w:color w:val="EE0000"/>
+        </w:rPr>
+        <w:t xml:space="preserve">: </w:t>
+      </w:r>
+      <w:r>
+        <w:rPr>
+          <w:color w:val="EE0000"/>
+        </w:rPr>
         <w:t>Include some reasonable randomness for when an item is produced or consumed.    </w:t>
       </w:r>
     </w:p>
@@ -359,6 +419,24 @@
         <w:rPr>
           <w:color w:val="EE0000"/>
         </w:rPr>
+        <w:t>TODO</w:t>
+      </w:r>
+      <w:r>
+        <w:rPr>
+          <w:color w:val="EE0000"/>
+        </w:rPr>
+        <w:t>5</w:t>
+      </w:r>
+      <w:r>
+        <w:rPr>
+          <w:color w:val="EE0000"/>
+        </w:rPr>
+        <w:t xml:space="preserve">: </w:t>
+      </w:r>
+      <w:r>
+        <w:rPr>
+          <w:color w:val="EE0000"/>
+        </w:rPr>
         <w:t xml:space="preserve">Use threading module types to create 4 producer threads and 5 consumer threads. Set </w:t>
       </w:r>
       <w:proofErr w:type="gramStart"/>
@@ -390,6 +468,24 @@
         <w:rPr>
           <w:color w:val="EE0000"/>
         </w:rPr>
+        <w:t>TODO</w:t>
+      </w:r>
+      <w:r>
+        <w:rPr>
+          <w:color w:val="EE0000"/>
+        </w:rPr>
+        <w:t>6</w:t>
+      </w:r>
+      <w:r>
+        <w:rPr>
+          <w:color w:val="EE0000"/>
+        </w:rPr>
+        <w:t xml:space="preserve">: </w:t>
+      </w:r>
+      <w:r>
+        <w:rPr>
+          <w:color w:val="EE0000"/>
+        </w:rPr>
         <w:t xml:space="preserve">Write the code with changeability in mind. All such values (number of threads, randomness, number of items, ...) should be easily </w:t>
       </w:r>
       <w:proofErr w:type="gramStart"/>
@@ -421,6 +517,24 @@
         <w:rPr>
           <w:color w:val="EE0000"/>
         </w:rPr>
+        <w:t>TODO</w:t>
+      </w:r>
+      <w:r>
+        <w:rPr>
+          <w:color w:val="EE0000"/>
+        </w:rPr>
+        <w:t>7</w:t>
+      </w:r>
+      <w:r>
+        <w:rPr>
+          <w:color w:val="EE0000"/>
+        </w:rPr>
+        <w:t xml:space="preserve">: </w:t>
+      </w:r>
+      <w:r>
+        <w:rPr>
+          <w:color w:val="EE0000"/>
+        </w:rPr>
         <w:t>The program should gracefully end when all produced items are consumed. Consumer threads can be daemon threads (for simplicity), but as usual you need to explain and document your choice. </w:t>
       </w:r>
     </w:p>
@@ -434,6 +548,24 @@
           <w:color w:val="EE0000"/>
         </w:rPr>
       </w:pPr>
+      <w:r>
+        <w:rPr>
+          <w:color w:val="EE0000"/>
+        </w:rPr>
+        <w:t>TODO</w:t>
+      </w:r>
+      <w:r>
+        <w:rPr>
+          <w:color w:val="EE0000"/>
+        </w:rPr>
+        <w:t>8</w:t>
+      </w:r>
+      <w:r>
+        <w:rPr>
+          <w:color w:val="EE0000"/>
+        </w:rPr>
+        <w:t xml:space="preserve">: </w:t>
+      </w:r>
       <w:r>
         <w:rPr>
           <w:color w:val="EE0000"/>
@@ -516,6 +648,119 @@
 <file path=word/numbering.xml><?xml version="1.0" encoding="utf-8"?>
 <w:numbering xmlns:wpc="http://schemas.microsoft.com/office/word/2010/wordprocessingCanvas" xmlns:cx="http://schemas.microsoft.com/office/drawing/2014/chartex" xmlns:cx1="http://schemas.microsoft.com/office/drawing/2015/9/8/chartex" xmlns:cx2="http://schemas.microsoft.com/office/drawing/2015/10/21/chartex" xmlns:cx3="http://schemas.microsoft.com/office/drawing/2016/5/9/chartex" xmlns:cx4="http://schemas.microsoft.com/office/drawing/2016/5/10/chartex" xmlns:cx5="http://schemas.microsoft.com/office/drawing/2016/5/11/chartex" xmlns:cx6="http://schemas.microsoft.com/office/drawing/2016/5/12/chartex" xmlns:cx7="http://schemas.microsoft.com/office/drawing/2016/5/13/chartex" xmlns:cx8="http://schemas.microsoft.com/office/drawing/2016/5/14/chartex" xmlns:mc="http://schemas.openxmlformats.org/markup-compatibility/2006" xmlns:aink="http://schemas.microsoft.com/office/drawing/2016/ink" xmlns:am3d="http://schemas.microsoft.com/office/drawing/2017/model3d" xmlns:o="urn:schemas-microsoft-com:office:office" xmlns:oel="http://schemas.microsoft.com/office/2019/extlst" xmlns:r="http://schemas.openxmlformats.org/officeDocument/2006/relationships" xmlns:m="http://schemas.openxmlformats.org/officeDocument/2006/math" xmlns:v="urn:schemas-microsoft-com:vml" xmlns:wp14="http://schemas.microsoft.com/office/word/2010/wordprocessingDrawing" xmlns:wp="http://schemas.openxmlformats.org/drawingml/2006/wordprocessingDrawing" xmlns:w10="urn:schemas-microsoft-com:office:word" xmlns:w="http://schemas.openxmlformats.org/wordprocessingml/2006/main" xmlns:w14="http://schemas.microsoft.com/office/word/2010/wordml" xmlns:w15="http://schemas.microsoft.com/office/word/2012/wordml" xmlns:w16cex="http://schemas.microsoft.com/office/word/2018/wordml/cex" xmlns:w16cid="http://schemas.microsoft.com/office/word/2016/wordml/cid" xmlns:w16="http://schemas.microsoft.com/office/word/2018/wordml" xmlns:w16du="http://schemas.microsoft.com/office/word/2023/wordml/word16du" xmlns:w16sdtdh="http://schemas.microsoft.com/office/word/2020/wordml/sdtdatahash" xmlns:w16sdtfl="http://schemas.microsoft.com/office/word/2024/wordml/sdtformatlock" xmlns:w16se="http://schemas.microsoft.com/office/word/2015/wordml/symex" xmlns:wpg="http://schemas.microsoft.com/office/word/2010/wordprocessingGroup" xmlns:wpi="http://schemas.microsoft.com/office/word/2010/wordprocessingInk" xmlns:wne="http://schemas.microsoft.com/office/word/2006/wordml" xmlns:wps="http://schemas.microsoft.com/office/word/2010/wordprocessingShape" mc:Ignorable="w14 w15 w16se w16cid w16 w16cex w16sdtdh w16sdtfl w16du wp14">
   <w:abstractNum w:abstractNumId="0" w15:restartNumberingAfterBreak="0">
+    <w:nsid w:val="23996A57"/>
+    <w:multiLevelType w:val="hybridMultilevel"/>
+    <w:tmpl w:val="B3542130"/>
+    <w:lvl w:ilvl="0" w:tplc="04090001">
+      <w:start w:val="1"/>
+      <w:numFmt w:val="bullet"/>
+      <w:lvlText w:val=""/>
+      <w:lvlJc w:val="left"/>
+      <w:pPr>
+        <w:ind w:left="720" w:hanging="360"/>
+      </w:pPr>
+      <w:rPr>
+        <w:rFonts w:ascii="Symbol" w:hAnsi="Symbol" w:hint="default"/>
+      </w:rPr>
+    </w:lvl>
+    <w:lvl w:ilvl="1" w:tplc="04090003" w:tentative="1">
+      <w:start w:val="1"/>
+      <w:numFmt w:val="bullet"/>
+      <w:lvlText w:val="o"/>
+      <w:lvlJc w:val="left"/>
+      <w:pPr>
+        <w:ind w:left="1440" w:hanging="360"/>
+      </w:pPr>
+      <w:rPr>
+        <w:rFonts w:ascii="Courier New" w:hAnsi="Courier New" w:cs="Courier New" w:hint="default"/>
+      </w:rPr>
+    </w:lvl>
+    <w:lvl w:ilvl="2" w:tplc="04090005" w:tentative="1">
+      <w:start w:val="1"/>
+      <w:numFmt w:val="bullet"/>
+      <w:lvlText w:val=""/>
+      <w:lvlJc w:val="left"/>
+      <w:pPr>
+        <w:ind w:left="2160" w:hanging="360"/>
+      </w:pPr>
+      <w:rPr>
+        <w:rFonts w:ascii="Wingdings" w:hAnsi="Wingdings" w:hint="default"/>
+      </w:rPr>
+    </w:lvl>
+    <w:lvl w:ilvl="3" w:tplc="04090001" w:tentative="1">
+      <w:start w:val="1"/>
+      <w:numFmt w:val="bullet"/>
+      <w:lvlText w:val=""/>
+      <w:lvlJc w:val="left"/>
+      <w:pPr>
+        <w:ind w:left="2880" w:hanging="360"/>
+      </w:pPr>
+      <w:rPr>
+        <w:rFonts w:ascii="Symbol" w:hAnsi="Symbol" w:hint="default"/>
+      </w:rPr>
+    </w:lvl>
+    <w:lvl w:ilvl="4" w:tplc="04090003" w:tentative="1">
+      <w:start w:val="1"/>
+      <w:numFmt w:val="bullet"/>
+      <w:lvlText w:val="o"/>
+      <w:lvlJc w:val="left"/>
+      <w:pPr>
+        <w:ind w:left="3600" w:hanging="360"/>
+      </w:pPr>
+      <w:rPr>
+        <w:rFonts w:ascii="Courier New" w:hAnsi="Courier New" w:cs="Courier New" w:hint="default"/>
+      </w:rPr>
+    </w:lvl>
+    <w:lvl w:ilvl="5" w:tplc="04090005" w:tentative="1">
+      <w:start w:val="1"/>
+      <w:numFmt w:val="bullet"/>
+      <w:lvlText w:val=""/>
+      <w:lvlJc w:val="left"/>
+      <w:pPr>
+        <w:ind w:left="4320" w:hanging="360"/>
+      </w:pPr>
+      <w:rPr>
+        <w:rFonts w:ascii="Wingdings" w:hAnsi="Wingdings" w:hint="default"/>
+      </w:rPr>
+    </w:lvl>
+    <w:lvl w:ilvl="6" w:tplc="04090001" w:tentative="1">
+      <w:start w:val="1"/>
+      <w:numFmt w:val="bullet"/>
+      <w:lvlText w:val=""/>
+      <w:lvlJc w:val="left"/>
+      <w:pPr>
+        <w:ind w:left="5040" w:hanging="360"/>
+      </w:pPr>
+      <w:rPr>
+        <w:rFonts w:ascii="Symbol" w:hAnsi="Symbol" w:hint="default"/>
+      </w:rPr>
+    </w:lvl>
+    <w:lvl w:ilvl="7" w:tplc="04090003" w:tentative="1">
+      <w:start w:val="1"/>
+      <w:numFmt w:val="bullet"/>
+      <w:lvlText w:val="o"/>
+      <w:lvlJc w:val="left"/>
+      <w:pPr>
+        <w:ind w:left="5760" w:hanging="360"/>
+      </w:pPr>
+      <w:rPr>
+        <w:rFonts w:ascii="Courier New" w:hAnsi="Courier New" w:cs="Courier New" w:hint="default"/>
+      </w:rPr>
+    </w:lvl>
+    <w:lvl w:ilvl="8" w:tplc="04090005" w:tentative="1">
+      <w:start w:val="1"/>
+      <w:numFmt w:val="bullet"/>
+      <w:lvlText w:val=""/>
+      <w:lvlJc w:val="left"/>
+      <w:pPr>
+        <w:ind w:left="6480" w:hanging="360"/>
+      </w:pPr>
+      <w:rPr>
+        <w:rFonts w:ascii="Wingdings" w:hAnsi="Wingdings" w:hint="default"/>
+      </w:rPr>
+    </w:lvl>
+  </w:abstractNum>
+  <w:abstractNum w:abstractNumId="1" w15:restartNumberingAfterBreak="0">
     <w:nsid w:val="7B52576B"/>
     <w:multiLevelType w:val="multilevel"/>
     <w:tmpl w:val="CC960F8C"/>
@@ -664,7 +909,7 @@
       </w:rPr>
     </w:lvl>
   </w:abstractNum>
-  <w:abstractNum w:abstractNumId="1" w15:restartNumberingAfterBreak="0">
+  <w:abstractNum w:abstractNumId="2" w15:restartNumberingAfterBreak="0">
     <w:nsid w:val="7B610F02"/>
     <w:multiLevelType w:val="multilevel"/>
     <w:tmpl w:val="E2AC8650"/>
@@ -814,9 +1059,12 @@
     </w:lvl>
   </w:abstractNum>
   <w:num w:numId="1" w16cid:durableId="691498307">
+    <w:abstractNumId w:val="2"/>
+  </w:num>
+  <w:num w:numId="2" w16cid:durableId="2050959021">
     <w:abstractNumId w:val="1"/>
   </w:num>
-  <w:num w:numId="2" w16cid:durableId="2050959021">
+  <w:num w:numId="3" w16cid:durableId="1350714689">
     <w:abstractNumId w:val="0"/>
   </w:num>
 </w:numbering>

</xml_diff>

<commit_message>
Commenting stuff and putting methods in
Made some more comments with stuff
</commit_message>
<xml_diff>
--- a/Part 2 Additional Documentation.docx
+++ b/Part 2 Additional Documentation.docx
@@ -314,19 +314,7 @@
         <w:rPr>
           <w:color w:val="EE0000"/>
         </w:rPr>
-        <w:t>TODO</w:t>
-      </w:r>
-      <w:r>
-        <w:rPr>
-          <w:color w:val="EE0000"/>
-        </w:rPr>
-        <w:t>2</w:t>
-      </w:r>
-      <w:r>
-        <w:rPr>
-          <w:color w:val="EE0000"/>
-        </w:rPr>
-        <w:t xml:space="preserve">: </w:t>
+        <w:t xml:space="preserve">TODO2: </w:t>
       </w:r>
       <w:r>
         <w:rPr>
@@ -349,19 +337,7 @@
         <w:rPr>
           <w:color w:val="EE0000"/>
         </w:rPr>
-        <w:t>TODO</w:t>
-      </w:r>
-      <w:r>
-        <w:rPr>
-          <w:color w:val="EE0000"/>
-        </w:rPr>
-        <w:t>3</w:t>
-      </w:r>
-      <w:r>
-        <w:rPr>
-          <w:color w:val="EE0000"/>
-        </w:rPr>
-        <w:t xml:space="preserve">: </w:t>
+        <w:t xml:space="preserve">TODO3: </w:t>
       </w:r>
       <w:r>
         <w:rPr>
@@ -384,19 +360,7 @@
         <w:rPr>
           <w:color w:val="EE0000"/>
         </w:rPr>
-        <w:t>TODO</w:t>
-      </w:r>
-      <w:r>
-        <w:rPr>
-          <w:color w:val="EE0000"/>
-        </w:rPr>
-        <w:t>4</w:t>
-      </w:r>
-      <w:r>
-        <w:rPr>
-          <w:color w:val="EE0000"/>
-        </w:rPr>
-        <w:t xml:space="preserve">: </w:t>
+        <w:t xml:space="preserve">TODO4: </w:t>
       </w:r>
       <w:r>
         <w:rPr>
@@ -419,19 +383,7 @@
         <w:rPr>
           <w:color w:val="EE0000"/>
         </w:rPr>
-        <w:t>TODO</w:t>
-      </w:r>
-      <w:r>
-        <w:rPr>
-          <w:color w:val="EE0000"/>
-        </w:rPr>
-        <w:t>5</w:t>
-      </w:r>
-      <w:r>
-        <w:rPr>
-          <w:color w:val="EE0000"/>
-        </w:rPr>
-        <w:t xml:space="preserve">: </w:t>
+        <w:t xml:space="preserve">TODO5: </w:t>
       </w:r>
       <w:r>
         <w:rPr>
@@ -468,19 +420,7 @@
         <w:rPr>
           <w:color w:val="EE0000"/>
         </w:rPr>
-        <w:t>TODO</w:t>
-      </w:r>
-      <w:r>
-        <w:rPr>
-          <w:color w:val="EE0000"/>
-        </w:rPr>
-        <w:t>6</w:t>
-      </w:r>
-      <w:r>
-        <w:rPr>
-          <w:color w:val="EE0000"/>
-        </w:rPr>
-        <w:t xml:space="preserve">: </w:t>
+        <w:t xml:space="preserve">TODO6: </w:t>
       </w:r>
       <w:r>
         <w:rPr>
@@ -517,19 +457,7 @@
         <w:rPr>
           <w:color w:val="EE0000"/>
         </w:rPr>
-        <w:t>TODO</w:t>
-      </w:r>
-      <w:r>
-        <w:rPr>
-          <w:color w:val="EE0000"/>
-        </w:rPr>
-        <w:t>7</w:t>
-      </w:r>
-      <w:r>
-        <w:rPr>
-          <w:color w:val="EE0000"/>
-        </w:rPr>
-        <w:t xml:space="preserve">: </w:t>
+        <w:t xml:space="preserve">TODO7: </w:t>
       </w:r>
       <w:r>
         <w:rPr>
@@ -552,19 +480,7 @@
         <w:rPr>
           <w:color w:val="EE0000"/>
         </w:rPr>
-        <w:t>TODO</w:t>
-      </w:r>
-      <w:r>
-        <w:rPr>
-          <w:color w:val="EE0000"/>
-        </w:rPr>
-        <w:t>8</w:t>
-      </w:r>
-      <w:r>
-        <w:rPr>
-          <w:color w:val="EE0000"/>
-        </w:rPr>
-        <w:t xml:space="preserve">: </w:t>
+        <w:t xml:space="preserve">TODO8: </w:t>
       </w:r>
       <w:r>
         <w:rPr>
@@ -1673,6 +1589,7 @@
   <w:style w:type="character" w:default="1" w:styleId="DefaultParagraphFont">
     <w:name w:val="Default Paragraph Font"/>
     <w:uiPriority w:val="1"/>
+    <w:semiHidden/>
     <w:unhideWhenUsed/>
   </w:style>
   <w:style w:type="table" w:default="1" w:styleId="TableNormal">

</xml_diff>

<commit_message>
Made final changes to the code and updated the documentation
</commit_message>
<xml_diff>
--- a/Part 2 Additional Documentation.docx
+++ b/Part 2 Additional Documentation.docx
@@ -8,118 +8,24 @@
           <w:color w:val="EE0000"/>
         </w:rPr>
       </w:pPr>
-      <w:proofErr w:type="gramStart"/>
-      <w:r>
-        <w:rPr>
-          <w:b/>
-          <w:bCs/>
+      <w:r>
+        <w:rPr>
           <w:color w:val="EE0000"/>
         </w:rPr>
-        <w:t>Part2</w:t>
-      </w:r>
-      <w:proofErr w:type="gramEnd"/>
-      <w:r>
-        <w:rPr>
-          <w:b/>
-          <w:bCs/>
+        <w:t xml:space="preserve"> Clearly explain your design decisions and implementation.</w:t>
+      </w:r>
+    </w:p>
+    <w:p>
+      <w:pPr>
+        <w:rPr>
           <w:color w:val="EE0000"/>
         </w:rPr>
-        <w:t xml:space="preserve"> additional documentation file</w:t>
-      </w:r>
+      </w:pPr>
       <w:r>
         <w:rPr>
           <w:color w:val="EE0000"/>
         </w:rPr>
-        <w:t xml:space="preserve"> (one .pdf file): Submit a rather short documentation file (up to 5 pages), somewhat </w:t>
-      </w:r>
-      <w:proofErr w:type="gramStart"/>
-      <w:r>
-        <w:rPr>
-          <w:color w:val="EE0000"/>
-        </w:rPr>
-        <w:t>similar to</w:t>
-      </w:r>
-      <w:proofErr w:type="gramEnd"/>
-      <w:r>
-        <w:rPr>
-          <w:color w:val="EE0000"/>
-        </w:rPr>
-        <w:t xml:space="preserve"> the </w:t>
-      </w:r>
-      <w:r>
-        <w:rPr>
-          <w:b/>
-          <w:bCs/>
-          <w:color w:val="EE0000"/>
-        </w:rPr>
-        <w:t>"</w:t>
-      </w:r>
-      <w:r>
-        <w:rPr>
-          <w:i/>
-          <w:iCs/>
-          <w:color w:val="EE0000"/>
-        </w:rPr>
-        <w:t>Part1 additional documentation file</w:t>
-      </w:r>
-      <w:r>
-        <w:rPr>
-          <w:b/>
-          <w:bCs/>
-          <w:color w:val="EE0000"/>
-        </w:rPr>
-        <w:t>",</w:t>
-      </w:r>
-      <w:r>
-        <w:rPr>
-          <w:color w:val="EE0000"/>
-        </w:rPr>
-        <w:t> to document the design and implementation of this portion of your project. Clearly explain your design decisions and implementation.</w:t>
-      </w:r>
-    </w:p>
-    <w:p>
-      <w:pPr>
-        <w:rPr>
-          <w:color w:val="EE0000"/>
-        </w:rPr>
-      </w:pPr>
-    </w:p>
-    <w:p>
-      <w:pPr>
-        <w:rPr>
-          <w:color w:val="EE0000"/>
-        </w:rPr>
-      </w:pPr>
-      <w:r>
-        <w:rPr>
-          <w:b/>
-          <w:bCs/>
-          <w:color w:val="EE0000"/>
-        </w:rPr>
-        <w:t>Part1 additional documentation file</w:t>
-      </w:r>
-      <w:r>
-        <w:rPr>
-          <w:color w:val="EE0000"/>
-        </w:rPr>
-        <w:t xml:space="preserve"> (one .pdf file): Submit a rather short documentation file (up to 5 pages) for the open-ended aspects of the project. This file does not replace the documentation you must have in the code as usual (readable code in the first place and useful comments statements and type hints), but it is meant to allow your group to provide your calculations, additional explanation, and your design consideration for any open-ended aspect of the project that you would need to document.  The purpose is to further demonstrate and document your understanding of the dynamics of the game and its limitations. </w:t>
-      </w:r>
-    </w:p>
-    <w:p>
-      <w:pPr>
-        <w:numPr>
-          <w:ilvl w:val="0"/>
-          <w:numId w:val="1"/>
-        </w:numPr>
-        <w:rPr>
-          <w:color w:val="EE0000"/>
-        </w:rPr>
-      </w:pPr>
-      <w:r>
-        <w:rPr>
-          <w:color w:val="EE0000"/>
-        </w:rPr>
-        <w:t xml:space="preserve">The document must include: </w:t>
+        <w:t xml:space="preserve">provide your calculations, additional explanation, and your design consideration  </w:t>
       </w:r>
     </w:p>
     <w:p>
@@ -132,14 +38,12 @@
           <w:color w:val="EE0000"/>
         </w:rPr>
       </w:pPr>
-      <w:proofErr w:type="gramStart"/>
       <w:r>
         <w:rPr>
           <w:color w:val="EE0000"/>
         </w:rPr>
-        <w:t>introduction</w:t>
-      </w:r>
-      <w:proofErr w:type="gramEnd"/>
+        <w:t xml:space="preserve">Design and implementation: clearly state different aspects of the implementation and design of open-ended aspects. </w:t>
+      </w:r>
     </w:p>
     <w:p>
       <w:pPr>
@@ -155,38 +59,7 @@
         <w:rPr>
           <w:color w:val="EE0000"/>
         </w:rPr>
-        <w:t>Design and implementation: clearly state different aspects of the implementation and design of open-ended aspects. For example, state how you implemented the pray capture (e.g. your calculation/geometry to explain under what conditions your program decides that the prey is captured), the movement, the pray placement, ... You must include graphic aids (illustrations, geometrical shapes, graphs, ...) to visually help with your explanation. Include any geometrical formulas or equations that you may have used. This section is meant to complement the code comments you have already must have included in the code.</w:t>
-      </w:r>
-    </w:p>
-    <w:p>
-      <w:pPr>
-        <w:numPr>
-          <w:ilvl w:val="1"/>
-          <w:numId w:val="1"/>
-        </w:numPr>
-        <w:rPr>
-          <w:color w:val="EE0000"/>
-        </w:rPr>
-      </w:pPr>
-      <w:r>
-        <w:rPr>
-          <w:color w:val="EE0000"/>
-        </w:rPr>
-        <w:t xml:space="preserve">Challenges: include any challenges that you faced, </w:t>
-      </w:r>
-      <w:proofErr w:type="gramStart"/>
-      <w:r>
-        <w:rPr>
-          <w:color w:val="EE0000"/>
-        </w:rPr>
-        <w:t>as well as,</w:t>
-      </w:r>
-      <w:proofErr w:type="gramEnd"/>
-      <w:r>
-        <w:rPr>
-          <w:color w:val="EE0000"/>
-        </w:rPr>
-        <w:t xml:space="preserve"> some incremental technical/implementation improvement(s) that you would consider for the future (explain only, but do not include in the submitted code).</w:t>
+        <w:t>Challenges: include any challenges that you faced, as well as, some incremental technical/implementation improvement(s) that you would consider for the future (explain only, but do not include in the submitted code).</w:t>
       </w:r>
     </w:p>
     <w:p>
@@ -216,7 +89,7 @@
         <w:rPr>
           <w:color w:val="EE0000"/>
         </w:rPr>
-        <w:t>We have looked at a few different implementations of the consumer-producer problem.  In this part of the project, you are to implement another implementation based on the python's own queue type.</w:t>
+        <w:t>In this part of the project, you are to implement another implementation based on the python's own queue type.</w:t>
       </w:r>
     </w:p>
     <w:p>
@@ -229,22 +102,7 @@
         <w:rPr>
           <w:color w:val="EE0000"/>
         </w:rPr>
-        <w:lastRenderedPageBreak/>
-        <w:t xml:space="preserve">The queue (from the Queue module of the </w:t>
-      </w:r>
-      <w:proofErr w:type="gramStart"/>
-      <w:r>
-        <w:rPr>
-          <w:color w:val="EE0000"/>
-        </w:rPr>
-        <w:t>python</w:t>
-      </w:r>
-      <w:proofErr w:type="gramEnd"/>
-      <w:r>
-        <w:rPr>
-          <w:color w:val="EE0000"/>
-        </w:rPr>
-        <w:t xml:space="preserve"> standard library) is a thread-safe data structure (we have used it in part 1 of the project as well) and can be used as an alternative way to allow consumer and producer tasks to cooperate without the risk of race condition.</w:t>
+        <w:t>The queue (from the Queue module of the python standard library) is a thread-safe data structure (we have used it in part 1 of the project as well) and can be used as an alternative way to allow consumer and producer tasks to cooperate without the risk of race condition.</w:t>
       </w:r>
     </w:p>
     <w:p>
@@ -274,7 +132,13 @@
         <w:rPr>
           <w:color w:val="EE0000"/>
         </w:rPr>
-        <w:t>Use the provided code skeleton.</w:t>
+        <w:t xml:space="preserve">TODO1: </w:t>
+      </w:r>
+      <w:r>
+        <w:rPr>
+          <w:color w:val="EE0000"/>
+        </w:rPr>
+        <w:t>Use the queue as the buffer used to store and retrieve items. Use FIFO queuing. You can assume any reasonable type (float, string, mixed types, ... but stay consistent) for the items.</w:t>
       </w:r>
     </w:p>
     <w:p>
@@ -291,13 +155,13 @@
         <w:rPr>
           <w:color w:val="EE0000"/>
         </w:rPr>
-        <w:t xml:space="preserve">TODO1: </w:t>
+        <w:t xml:space="preserve">TODO7: </w:t>
       </w:r>
       <w:r>
         <w:rPr>
           <w:color w:val="EE0000"/>
         </w:rPr>
-        <w:t>Use the queue as the buffer used to store and retrieve items. Use FIFO queuing. You can assume any reasonable type (float, string, mixed types, ... but stay consistent) for the items.</w:t>
+        <w:t>The program should gracefully end when all produced items are consumed. Consumer threads can be daemon threads (for simplicity), but as usual you need to explain and document your choice. </w:t>
       </w:r>
     </w:p>
     <w:p>
@@ -314,164 +178,1348 @@
         <w:rPr>
           <w:color w:val="EE0000"/>
         </w:rPr>
-        <w:t xml:space="preserve">TODO2: </w:t>
+        <w:t xml:space="preserve">TODO8: </w:t>
       </w:r>
       <w:r>
         <w:rPr>
           <w:color w:val="EE0000"/>
         </w:rPr>
-        <w:t>Do not use any other synchronization primitive (lock, semaphore, ...), or buffering structure (circular buffer, ...).</w:t>
-      </w:r>
-    </w:p>
-    <w:p>
-      <w:pPr>
+        <w:t>Fully document your code as usual (that is include comments, docstrings for every method or type, type hints, ...).</w:t>
+      </w:r>
+    </w:p>
+    <w:p>
+      <w:pPr>
+        <w:rPr>
+          <w:color w:val="EE0000"/>
+        </w:rPr>
+      </w:pPr>
+    </w:p>
+    <w:p/>
+    <w:p>
+      <w:r>
+        <w:t>TD</w:t>
+      </w:r>
+    </w:p>
+    <w:p>
+      <w:r>
+        <w:br w:type="page"/>
+      </w:r>
+    </w:p>
+    <w:p>
+      <w:pPr>
+        <w:pStyle w:val="Heading1"/>
+      </w:pPr>
+      <w:r>
+        <w:lastRenderedPageBreak/>
+        <w:t>Part 2: Producer-Consumer with Queue Implementation</w:t>
+      </w:r>
+    </w:p>
+    <w:p>
+      <w:r>
+        <w:t>Group #: B21</w:t>
+      </w:r>
+    </w:p>
+    <w:p>
+      <w:r>
+        <w:rPr>
+          <w:noProof/>
+        </w:rPr>
+        <mc:AlternateContent>
+          <mc:Choice Requires="wps">
+            <w:drawing>
+              <wp:anchor distT="0" distB="0" distL="114300" distR="114300" simplePos="0" relativeHeight="251659264" behindDoc="0" locked="0" layoutInCell="1" allowOverlap="1" wp14:anchorId="0E3AF8BC" wp14:editId="139119AD">
+                <wp:simplePos x="0" y="0"/>
+                <wp:positionH relativeFrom="column">
+                  <wp:posOffset>-38100</wp:posOffset>
+                </wp:positionH>
+                <wp:positionV relativeFrom="paragraph">
+                  <wp:posOffset>263525</wp:posOffset>
+                </wp:positionV>
+                <wp:extent cx="6638925" cy="0"/>
+                <wp:effectExtent l="0" t="0" r="0" b="0"/>
+                <wp:wrapNone/>
+                <wp:docPr id="317103833" name="Straight Connector 1"/>
+                <wp:cNvGraphicFramePr/>
+                <a:graphic xmlns:a="http://schemas.openxmlformats.org/drawingml/2006/main">
+                  <a:graphicData uri="http://schemas.microsoft.com/office/word/2010/wordprocessingShape">
+                    <wps:wsp>
+                      <wps:cNvCnPr/>
+                      <wps:spPr>
+                        <a:xfrm>
+                          <a:off x="0" y="0"/>
+                          <a:ext cx="6638925" cy="0"/>
+                        </a:xfrm>
+                        <a:prstGeom prst="line">
+                          <a:avLst/>
+                        </a:prstGeom>
+                      </wps:spPr>
+                      <wps:style>
+                        <a:lnRef idx="2">
+                          <a:schemeClr val="dk1"/>
+                        </a:lnRef>
+                        <a:fillRef idx="0">
+                          <a:schemeClr val="dk1"/>
+                        </a:fillRef>
+                        <a:effectRef idx="1">
+                          <a:schemeClr val="dk1"/>
+                        </a:effectRef>
+                        <a:fontRef idx="minor">
+                          <a:schemeClr val="tx1"/>
+                        </a:fontRef>
+                      </wps:style>
+                      <wps:bodyPr/>
+                    </wps:wsp>
+                  </a:graphicData>
+                </a:graphic>
+              </wp:anchor>
+            </w:drawing>
+          </mc:Choice>
+          <mc:Fallback>
+            <w:pict>
+              <v:line w14:anchorId="041D3201" id="Straight Connector 1" o:spid="_x0000_s1026" style="position:absolute;z-index:251659264;visibility:visible;mso-wrap-style:square;mso-wrap-distance-left:9pt;mso-wrap-distance-top:0;mso-wrap-distance-right:9pt;mso-wrap-distance-bottom:0;mso-position-horizontal:absolute;mso-position-horizontal-relative:text;mso-position-vertical:absolute;mso-position-vertical-relative:text" from="-3pt,20.75pt" to="519.75pt,20.75pt" o:gfxdata="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" strokecolor="black [3200]" strokeweight="1.5pt">
+                <v:stroke joinstyle="miter"/>
+              </v:line>
+            </w:pict>
+          </mc:Fallback>
+        </mc:AlternateContent>
+      </w:r>
+      <w:r>
+        <w:t>Student names: Anna Bartl and Conor O'Neill</w:t>
+      </w:r>
+    </w:p>
+    <w:p/>
+    <w:p>
+      <w:pPr>
+        <w:pStyle w:val="Heading2"/>
+        <w:numPr>
+          <w:ilvl w:val="0"/>
+          <w:numId w:val="5"/>
+        </w:numPr>
+      </w:pPr>
+      <w:r>
+        <w:t>Introduction</w:t>
+      </w:r>
+    </w:p>
+    <w:p>
+      <w:r>
+        <w:t xml:space="preserve">The description of the design and implementation for the producer-consumer program using a singular buffer queue as the main synchronization is outlined in the document with particular emphasis on the main subcomponent decisions. </w:t>
+      </w:r>
+      <w:r>
+        <w:t>The code is written with allowance for changeability in all main parameters with the initial implementation using 5 consumers, 4 producers, 22 total items to produce and between 0.1 and 0.5 seconds of random wait time, following the technical specifications for initial design. Graceful shutdown of the program is completed once all the producers have finished producing items and the queue has been emptied by the daemonic consumers.</w:t>
+      </w:r>
+    </w:p>
+    <w:p/>
+    <w:p>
+      <w:pPr>
+        <w:pStyle w:val="Heading2"/>
+        <w:numPr>
+          <w:ilvl w:val="0"/>
+          <w:numId w:val="5"/>
+        </w:numPr>
+      </w:pPr>
+      <w:r>
+        <w:t>Design and Implementation</w:t>
+      </w:r>
+    </w:p>
+    <w:p>
+      <w:r>
+        <w:t xml:space="preserve">Overall design has followed the technical requirements outlined in the assignment </w:t>
+      </w:r>
+      <w:r>
+        <w:t>document. Design decisions for specifics on implementation are sectioned below.</w:t>
+      </w:r>
+    </w:p>
+    <w:p>
+      <w:pPr>
+        <w:pStyle w:val="Heading3"/>
+        <w:numPr>
+          <w:ilvl w:val="1"/>
+          <w:numId w:val="5"/>
+        </w:numPr>
+      </w:pPr>
+      <w:r>
+        <w:t>Architecture Overview</w:t>
+      </w:r>
+    </w:p>
+    <w:p>
+      <w:r>
+        <w:t>TD</w:t>
+      </w:r>
+    </w:p>
+    <w:p>
+      <w:pPr>
+        <w:pStyle w:val="Heading3"/>
+        <w:numPr>
+          <w:ilvl w:val="1"/>
+          <w:numId w:val="5"/>
+        </w:numPr>
+      </w:pPr>
+      <w:r>
+        <w:t>Shared Buffer</w:t>
+      </w:r>
+    </w:p>
+    <w:p>
+      <w:r>
+        <w:t>TD</w:t>
+      </w:r>
+    </w:p>
+    <w:p>
+      <w:pPr>
+        <w:pStyle w:val="Heading3"/>
+        <w:numPr>
+          <w:ilvl w:val="1"/>
+          <w:numId w:val="5"/>
+        </w:numPr>
+      </w:pPr>
+      <w:r>
+        <w:t>Work Distribution</w:t>
+      </w:r>
+    </w:p>
+    <w:p>
+      <w:r>
+        <w:t>TD</w:t>
+      </w:r>
+    </w:p>
+    <w:p>
+      <w:pPr>
+        <w:pStyle w:val="Heading3"/>
+        <w:numPr>
+          <w:ilvl w:val="1"/>
+          <w:numId w:val="5"/>
+        </w:numPr>
+      </w:pPr>
+      <w:r>
+        <w:t>Graceful Shutdown</w:t>
+      </w:r>
+    </w:p>
+    <w:p>
+      <w:r>
+        <w:t>TD</w:t>
+      </w:r>
+    </w:p>
+    <w:p>
+      <w:pPr>
+        <w:pStyle w:val="Heading3"/>
+        <w:numPr>
+          <w:ilvl w:val="1"/>
+          <w:numId w:val="5"/>
+        </w:numPr>
+      </w:pPr>
+      <w:r>
+        <w:t xml:space="preserve">Daemon Threads for Consumers </w:t>
+      </w:r>
+    </w:p>
+    <w:p>
+      <w:r>
+        <w:t>TD</w:t>
+      </w:r>
+    </w:p>
+    <w:p>
+      <w:pPr>
+        <w:pStyle w:val="Heading3"/>
+        <w:numPr>
+          <w:ilvl w:val="1"/>
+          <w:numId w:val="5"/>
+        </w:numPr>
+      </w:pPr>
+      <w:r>
+        <w:lastRenderedPageBreak/>
+        <w:t>Changeability</w:t>
+      </w:r>
+    </w:p>
+    <w:p>
+      <w:r>
+        <w:t>As per the technical specifications, no magic numbers were implemented and all variables were instantiated at the top of the code for easy modification before runtime. The table below outlines the variable names, types and purpose</w:t>
+      </w:r>
+    </w:p>
+    <w:p>
+      <w:pPr>
+        <w:jc w:val="center"/>
+      </w:pPr>
+      <w:r>
+        <w:t xml:space="preserve">Table </w:t>
+      </w:r>
+      <w:r>
+        <w:t>TD</w:t>
+      </w:r>
+      <w:r>
+        <w:t xml:space="preserve"> – Global Variable Definitions</w:t>
+      </w:r>
+    </w:p>
+    <w:tbl>
+      <w:tblPr>
+        <w:tblStyle w:val="TableGrid"/>
+        <w:tblW w:w="0" w:type="auto"/>
+        <w:tblLook w:val="04A0" w:firstRow="1" w:lastRow="0" w:firstColumn="1" w:lastColumn="0" w:noHBand="0" w:noVBand="1"/>
+      </w:tblPr>
+      <w:tblGrid>
+        <w:gridCol w:w="3361"/>
+        <w:gridCol w:w="2124"/>
+        <w:gridCol w:w="3863"/>
+      </w:tblGrid>
+      <w:tr>
+        <w:tc>
+          <w:tcPr>
+            <w:tcW w:w="3098" w:type="dxa"/>
+            <w:shd w:val="clear" w:color="auto" w:fill="ADADAD" w:themeFill="background2" w:themeFillShade="BF"/>
+          </w:tcPr>
+          <w:p>
+            <w:pPr>
+              <w:jc w:val="both"/>
+            </w:pPr>
+            <w:r>
+              <w:t>Variable</w:t>
+            </w:r>
+          </w:p>
+        </w:tc>
+        <w:tc>
+          <w:tcPr>
+            <w:tcW w:w="2124" w:type="dxa"/>
+            <w:shd w:val="clear" w:color="auto" w:fill="ADADAD" w:themeFill="background2" w:themeFillShade="BF"/>
+          </w:tcPr>
+          <w:p>
+            <w:pPr>
+              <w:jc w:val="both"/>
+            </w:pPr>
+            <w:r>
+              <w:t>Type</w:t>
+            </w:r>
+          </w:p>
+        </w:tc>
+        <w:tc>
+          <w:tcPr>
+            <w:tcW w:w="3863" w:type="dxa"/>
+            <w:shd w:val="clear" w:color="auto" w:fill="ADADAD" w:themeFill="background2" w:themeFillShade="BF"/>
+          </w:tcPr>
+          <w:p>
+            <w:pPr>
+              <w:jc w:val="both"/>
+            </w:pPr>
+            <w:r>
+              <w:t>Notes</w:t>
+            </w:r>
+          </w:p>
+        </w:tc>
+      </w:tr>
+      <w:tr>
+        <w:tc>
+          <w:tcPr>
+            <w:tcW w:w="3098" w:type="dxa"/>
+          </w:tcPr>
+          <w:p>
+            <w:pPr>
+              <w:jc w:val="both"/>
+            </w:pPr>
+            <w:r>
+              <w:t>NUMBER_OF_CONSUMERS</w:t>
+            </w:r>
+          </w:p>
+        </w:tc>
+        <w:tc>
+          <w:tcPr>
+            <w:tcW w:w="2124" w:type="dxa"/>
+          </w:tcPr>
+          <w:p>
+            <w:pPr>
+              <w:jc w:val="both"/>
+            </w:pPr>
+            <w:r>
+              <w:t>Int</w:t>
+            </w:r>
+          </w:p>
+        </w:tc>
+        <w:tc>
+          <w:tcPr>
+            <w:tcW w:w="3863" w:type="dxa"/>
+          </w:tcPr>
+          <w:p>
+            <w:pPr>
+              <w:jc w:val="both"/>
+            </w:pPr>
+            <w:r>
+              <w:t>Used to declare how many consumers are used</w:t>
+            </w:r>
+          </w:p>
+        </w:tc>
+      </w:tr>
+      <w:tr>
+        <w:tc>
+          <w:tcPr>
+            <w:tcW w:w="3098" w:type="dxa"/>
+          </w:tcPr>
+          <w:p>
+            <w:pPr>
+              <w:jc w:val="both"/>
+            </w:pPr>
+            <w:r>
+              <w:t>NUMBER_OF_PRODUCERS</w:t>
+            </w:r>
+          </w:p>
+        </w:tc>
+        <w:tc>
+          <w:tcPr>
+            <w:tcW w:w="2124" w:type="dxa"/>
+          </w:tcPr>
+          <w:p>
+            <w:pPr>
+              <w:jc w:val="both"/>
+            </w:pPr>
+            <w:r>
+              <w:t>int</w:t>
+            </w:r>
+          </w:p>
+        </w:tc>
+        <w:tc>
+          <w:tcPr>
+            <w:tcW w:w="3863" w:type="dxa"/>
+          </w:tcPr>
+          <w:p>
+            <w:pPr>
+              <w:jc w:val="both"/>
+            </w:pPr>
+            <w:r>
+              <w:t xml:space="preserve">Used to declare how many </w:t>
+            </w:r>
+            <w:r>
+              <w:t xml:space="preserve">producers </w:t>
+            </w:r>
+            <w:r>
+              <w:t>are used</w:t>
+            </w:r>
+          </w:p>
+        </w:tc>
+      </w:tr>
+      <w:tr>
+        <w:tc>
+          <w:tcPr>
+            <w:tcW w:w="3098" w:type="dxa"/>
+          </w:tcPr>
+          <w:p>
+            <w:pPr>
+              <w:jc w:val="both"/>
+            </w:pPr>
+            <w:r>
+              <w:t>TOTAL_ITEMS</w:t>
+            </w:r>
+          </w:p>
+        </w:tc>
+        <w:tc>
+          <w:tcPr>
+            <w:tcW w:w="2124" w:type="dxa"/>
+          </w:tcPr>
+          <w:p>
+            <w:pPr>
+              <w:jc w:val="both"/>
+            </w:pPr>
+            <w:r>
+              <w:t>Int</w:t>
+            </w:r>
+          </w:p>
+        </w:tc>
+        <w:tc>
+          <w:tcPr>
+            <w:tcW w:w="3863" w:type="dxa"/>
+          </w:tcPr>
+          <w:p>
+            <w:pPr>
+              <w:jc w:val="both"/>
+            </w:pPr>
+            <w:r>
+              <w:t>Define how many total items will be produced</w:t>
+            </w:r>
+          </w:p>
+        </w:tc>
+      </w:tr>
+      <w:tr>
+        <w:tc>
+          <w:tcPr>
+            <w:tcW w:w="3098" w:type="dxa"/>
+          </w:tcPr>
+          <w:p>
+            <w:pPr>
+              <w:jc w:val="both"/>
+            </w:pPr>
+            <w:r>
+              <w:t>RANDOM_PRODUCER_SLEEP</w:t>
+            </w:r>
+          </w:p>
+        </w:tc>
+        <w:tc>
+          <w:tcPr>
+            <w:tcW w:w="2124" w:type="dxa"/>
+          </w:tcPr>
+          <w:p>
+            <w:pPr>
+              <w:jc w:val="both"/>
+            </w:pPr>
+            <w:r>
+              <w:t>tuple[float, float]</w:t>
+            </w:r>
+          </w:p>
+        </w:tc>
+        <w:tc>
+          <w:tcPr>
+            <w:tcW w:w="3863" w:type="dxa"/>
+          </w:tcPr>
+          <w:p>
+            <w:pPr>
+              <w:jc w:val="both"/>
+            </w:pPr>
+            <w:r>
+              <w:t xml:space="preserve">Range of sleep time for producers </w:t>
+            </w:r>
+            <w:r>
+              <w:t>in seconds</w:t>
+            </w:r>
+          </w:p>
+        </w:tc>
+      </w:tr>
+      <w:tr>
+        <w:tc>
+          <w:tcPr>
+            <w:tcW w:w="3098" w:type="dxa"/>
+          </w:tcPr>
+          <w:p>
+            <w:pPr>
+              <w:jc w:val="both"/>
+            </w:pPr>
+            <w:r>
+              <w:t>RANDOM_</w:t>
+            </w:r>
+            <w:r>
+              <w:t>CONSUMER</w:t>
+            </w:r>
+            <w:r>
+              <w:t>_SLEEP</w:t>
+            </w:r>
+          </w:p>
+        </w:tc>
+        <w:tc>
+          <w:tcPr>
+            <w:tcW w:w="2124" w:type="dxa"/>
+          </w:tcPr>
+          <w:p>
+            <w:pPr>
+              <w:jc w:val="both"/>
+            </w:pPr>
+            <w:r>
+              <w:t>tuple[float, float]</w:t>
+            </w:r>
+          </w:p>
+        </w:tc>
+        <w:tc>
+          <w:tcPr>
+            <w:tcW w:w="3863" w:type="dxa"/>
+          </w:tcPr>
+          <w:p>
+            <w:pPr>
+              <w:jc w:val="both"/>
+            </w:pPr>
+            <w:r>
+              <w:t>Range of sleep time for producers</w:t>
+            </w:r>
+            <w:r>
+              <w:t xml:space="preserve"> in seconds</w:t>
+            </w:r>
+          </w:p>
+        </w:tc>
+      </w:tr>
+    </w:tbl>
+    <w:p/>
+    <w:p>
+      <w:r>
+        <w:t>At the top of the script, the variables from Table TD are declared as seen below:</w:t>
+      </w:r>
+    </w:p>
+    <w:p>
+      <w:pPr>
+        <w:pStyle w:val="ListParagraph"/>
         <w:numPr>
           <w:ilvl w:val="0"/>
           <w:numId w:val="2"/>
         </w:numPr>
-        <w:rPr>
-          <w:color w:val="EE0000"/>
-        </w:rPr>
-      </w:pPr>
-      <w:r>
-        <w:rPr>
-          <w:color w:val="EE0000"/>
-        </w:rPr>
-        <w:t xml:space="preserve">TODO3: </w:t>
-      </w:r>
-      <w:r>
-        <w:rPr>
-          <w:color w:val="EE0000"/>
-        </w:rPr>
-        <w:t>Do not include any other import other than the ones in the skeleton code.</w:t>
-      </w:r>
-    </w:p>
-    <w:p>
-      <w:pPr>
+        <w:shd w:val="clear" w:color="auto" w:fill="121314"/>
+        <w:spacing w:after="0" w:line="330" w:lineRule="atLeast"/>
+        <w:rPr>
+          <w:rFonts w:ascii="Consolas" w:eastAsia="Times New Roman" w:hAnsi="Consolas" w:cs="Times New Roman"/>
+          <w:color w:val="BBBEBF"/>
+          <w:kern w:val="0"/>
+          <w:sz w:val="25"/>
+          <w:szCs w:val="25"/>
+          <w14:ligatures w14:val="none"/>
+        </w:rPr>
+      </w:pPr>
+      <w:r>
+        <w:rPr>
+          <w:rFonts w:ascii="Consolas" w:eastAsia="Times New Roman" w:hAnsi="Consolas" w:cs="Times New Roman"/>
+          <w:color w:val="8B949E"/>
+          <w:kern w:val="0"/>
+          <w:sz w:val="25"/>
+          <w:szCs w:val="25"/>
+          <w14:ligatures w14:val="none"/>
+        </w:rPr>
+        <w:t># --- Global variable definitions --- #</w:t>
+      </w:r>
+    </w:p>
+    <w:p>
+      <w:pPr>
+        <w:pStyle w:val="ListParagraph"/>
         <w:numPr>
           <w:ilvl w:val="0"/>
           <w:numId w:val="2"/>
         </w:numPr>
-        <w:rPr>
-          <w:color w:val="EE0000"/>
-        </w:rPr>
-      </w:pPr>
-      <w:r>
-        <w:rPr>
-          <w:color w:val="EE0000"/>
-        </w:rPr>
-        <w:t xml:space="preserve">TODO4: </w:t>
-      </w:r>
-      <w:r>
-        <w:rPr>
-          <w:color w:val="EE0000"/>
-        </w:rPr>
-        <w:t>Include some reasonable randomness for when an item is produced or consumed.    </w:t>
-      </w:r>
-    </w:p>
-    <w:p>
-      <w:pPr>
+        <w:shd w:val="clear" w:color="auto" w:fill="121314"/>
+        <w:spacing w:after="0" w:line="330" w:lineRule="atLeast"/>
+        <w:rPr>
+          <w:rFonts w:ascii="Consolas" w:eastAsia="Times New Roman" w:hAnsi="Consolas" w:cs="Times New Roman"/>
+          <w:color w:val="BBBEBF"/>
+          <w:kern w:val="0"/>
+          <w:sz w:val="25"/>
+          <w:szCs w:val="25"/>
+          <w14:ligatures w14:val="none"/>
+        </w:rPr>
+      </w:pPr>
+      <w:r>
+        <w:rPr>
+          <w:rFonts w:ascii="Consolas" w:eastAsia="Times New Roman" w:hAnsi="Consolas" w:cs="Times New Roman"/>
+          <w:color w:val="79C0FF"/>
+          <w:kern w:val="0"/>
+          <w:sz w:val="25"/>
+          <w:szCs w:val="25"/>
+          <w14:ligatures w14:val="none"/>
+        </w:rPr>
+        <w:t>NUMBER_OF_CONSUMERS</w:t>
+      </w:r>
+      <w:r>
+        <w:rPr>
+          <w:rFonts w:ascii="Consolas" w:eastAsia="Times New Roman" w:hAnsi="Consolas" w:cs="Times New Roman"/>
+          <w:color w:val="BBBEBF"/>
+          <w:kern w:val="0"/>
+          <w:sz w:val="25"/>
+          <w:szCs w:val="25"/>
+          <w14:ligatures w14:val="none"/>
+        </w:rPr>
+        <w:t xml:space="preserve">: </w:t>
+      </w:r>
+      <w:r>
+        <w:rPr>
+          <w:rFonts w:ascii="Consolas" w:eastAsia="Times New Roman" w:hAnsi="Consolas" w:cs="Times New Roman"/>
+          <w:color w:val="4EC9B0"/>
+          <w:kern w:val="0"/>
+          <w:sz w:val="25"/>
+          <w:szCs w:val="25"/>
+          <w14:ligatures w14:val="none"/>
+        </w:rPr>
+        <w:t>int</w:t>
+      </w:r>
+      <w:r>
+        <w:rPr>
+          <w:rFonts w:ascii="Consolas" w:eastAsia="Times New Roman" w:hAnsi="Consolas" w:cs="Times New Roman"/>
+          <w:color w:val="BBBEBF"/>
+          <w:kern w:val="0"/>
+          <w:sz w:val="25"/>
+          <w:szCs w:val="25"/>
+          <w14:ligatures w14:val="none"/>
+        </w:rPr>
+        <w:t xml:space="preserve"> </w:t>
+      </w:r>
+      <w:r>
+        <w:rPr>
+          <w:rFonts w:ascii="Consolas" w:eastAsia="Times New Roman" w:hAnsi="Consolas" w:cs="Times New Roman"/>
+          <w:color w:val="D4D4D4"/>
+          <w:kern w:val="0"/>
+          <w:sz w:val="25"/>
+          <w:szCs w:val="25"/>
+          <w14:ligatures w14:val="none"/>
+        </w:rPr>
+        <w:t>=</w:t>
+      </w:r>
+      <w:r>
+        <w:rPr>
+          <w:rFonts w:ascii="Consolas" w:eastAsia="Times New Roman" w:hAnsi="Consolas" w:cs="Times New Roman"/>
+          <w:color w:val="BBBEBF"/>
+          <w:kern w:val="0"/>
+          <w:sz w:val="25"/>
+          <w:szCs w:val="25"/>
+          <w14:ligatures w14:val="none"/>
+        </w:rPr>
+        <w:t xml:space="preserve"> </w:t>
+      </w:r>
+      <w:r>
+        <w:rPr>
+          <w:rFonts w:ascii="Consolas" w:eastAsia="Times New Roman" w:hAnsi="Consolas" w:cs="Times New Roman"/>
+          <w:color w:val="B5CEA8"/>
+          <w:kern w:val="0"/>
+          <w:sz w:val="25"/>
+          <w:szCs w:val="25"/>
+          <w14:ligatures w14:val="none"/>
+        </w:rPr>
+        <w:t>5</w:t>
+      </w:r>
+      <w:r>
+        <w:rPr>
+          <w:rFonts w:ascii="Consolas" w:eastAsia="Times New Roman" w:hAnsi="Consolas" w:cs="Times New Roman"/>
+          <w:color w:val="BBBEBF"/>
+          <w:kern w:val="0"/>
+          <w:sz w:val="25"/>
+          <w:szCs w:val="25"/>
+          <w14:ligatures w14:val="none"/>
+        </w:rPr>
+        <w:t xml:space="preserve"> </w:t>
+      </w:r>
+      <w:r>
+        <w:rPr>
+          <w:rFonts w:ascii="Consolas" w:eastAsia="Times New Roman" w:hAnsi="Consolas" w:cs="Times New Roman"/>
+          <w:color w:val="8B949E"/>
+          <w:kern w:val="0"/>
+          <w:sz w:val="25"/>
+          <w:szCs w:val="25"/>
+          <w14:ligatures w14:val="none"/>
+        </w:rPr>
+        <w:t># Number of consumers</w:t>
+      </w:r>
+    </w:p>
+    <w:p>
+      <w:pPr>
+        <w:pStyle w:val="ListParagraph"/>
         <w:numPr>
           <w:ilvl w:val="0"/>
           <w:numId w:val="2"/>
         </w:numPr>
-        <w:rPr>
-          <w:color w:val="EE0000"/>
-        </w:rPr>
-      </w:pPr>
-      <w:r>
-        <w:rPr>
-          <w:color w:val="EE0000"/>
-        </w:rPr>
-        <w:t xml:space="preserve">TODO5: </w:t>
-      </w:r>
-      <w:r>
-        <w:rPr>
-          <w:color w:val="EE0000"/>
-        </w:rPr>
-        <w:t xml:space="preserve">Use threading module types to create 4 producer threads and 5 consumer threads. Set </w:t>
-      </w:r>
-      <w:proofErr w:type="gramStart"/>
-      <w:r>
-        <w:rPr>
-          <w:color w:val="EE0000"/>
-        </w:rPr>
-        <w:t>to produce</w:t>
-      </w:r>
-      <w:proofErr w:type="gramEnd"/>
-      <w:r>
-        <w:rPr>
-          <w:color w:val="EE0000"/>
-        </w:rPr>
-        <w:t xml:space="preserve"> a reasonably manageable number of items (to simplify testing).</w:t>
-      </w:r>
-    </w:p>
-    <w:p>
-      <w:pPr>
+        <w:shd w:val="clear" w:color="auto" w:fill="121314"/>
+        <w:spacing w:after="0" w:line="330" w:lineRule="atLeast"/>
+        <w:rPr>
+          <w:rFonts w:ascii="Consolas" w:eastAsia="Times New Roman" w:hAnsi="Consolas" w:cs="Times New Roman"/>
+          <w:color w:val="BBBEBF"/>
+          <w:kern w:val="0"/>
+          <w:sz w:val="25"/>
+          <w:szCs w:val="25"/>
+          <w14:ligatures w14:val="none"/>
+        </w:rPr>
+      </w:pPr>
+      <w:r>
+        <w:rPr>
+          <w:rFonts w:ascii="Consolas" w:eastAsia="Times New Roman" w:hAnsi="Consolas" w:cs="Times New Roman"/>
+          <w:color w:val="79C0FF"/>
+          <w:kern w:val="0"/>
+          <w:sz w:val="25"/>
+          <w:szCs w:val="25"/>
+          <w14:ligatures w14:val="none"/>
+        </w:rPr>
+        <w:t>NUMBER_OF_PRODUCERS</w:t>
+      </w:r>
+      <w:r>
+        <w:rPr>
+          <w:rFonts w:ascii="Consolas" w:eastAsia="Times New Roman" w:hAnsi="Consolas" w:cs="Times New Roman"/>
+          <w:color w:val="BBBEBF"/>
+          <w:kern w:val="0"/>
+          <w:sz w:val="25"/>
+          <w:szCs w:val="25"/>
+          <w14:ligatures w14:val="none"/>
+        </w:rPr>
+        <w:t xml:space="preserve">: </w:t>
+      </w:r>
+      <w:r>
+        <w:rPr>
+          <w:rFonts w:ascii="Consolas" w:eastAsia="Times New Roman" w:hAnsi="Consolas" w:cs="Times New Roman"/>
+          <w:color w:val="4EC9B0"/>
+          <w:kern w:val="0"/>
+          <w:sz w:val="25"/>
+          <w:szCs w:val="25"/>
+          <w14:ligatures w14:val="none"/>
+        </w:rPr>
+        <w:t>int</w:t>
+      </w:r>
+      <w:r>
+        <w:rPr>
+          <w:rFonts w:ascii="Consolas" w:eastAsia="Times New Roman" w:hAnsi="Consolas" w:cs="Times New Roman"/>
+          <w:color w:val="BBBEBF"/>
+          <w:kern w:val="0"/>
+          <w:sz w:val="25"/>
+          <w:szCs w:val="25"/>
+          <w14:ligatures w14:val="none"/>
+        </w:rPr>
+        <w:t xml:space="preserve"> </w:t>
+      </w:r>
+      <w:r>
+        <w:rPr>
+          <w:rFonts w:ascii="Consolas" w:eastAsia="Times New Roman" w:hAnsi="Consolas" w:cs="Times New Roman"/>
+          <w:color w:val="D4D4D4"/>
+          <w:kern w:val="0"/>
+          <w:sz w:val="25"/>
+          <w:szCs w:val="25"/>
+          <w14:ligatures w14:val="none"/>
+        </w:rPr>
+        <w:t>=</w:t>
+      </w:r>
+      <w:r>
+        <w:rPr>
+          <w:rFonts w:ascii="Consolas" w:eastAsia="Times New Roman" w:hAnsi="Consolas" w:cs="Times New Roman"/>
+          <w:color w:val="BBBEBF"/>
+          <w:kern w:val="0"/>
+          <w:sz w:val="25"/>
+          <w:szCs w:val="25"/>
+          <w14:ligatures w14:val="none"/>
+        </w:rPr>
+        <w:t xml:space="preserve"> </w:t>
+      </w:r>
+      <w:r>
+        <w:rPr>
+          <w:rFonts w:ascii="Consolas" w:eastAsia="Times New Roman" w:hAnsi="Consolas" w:cs="Times New Roman"/>
+          <w:color w:val="B5CEA8"/>
+          <w:kern w:val="0"/>
+          <w:sz w:val="25"/>
+          <w:szCs w:val="25"/>
+          <w14:ligatures w14:val="none"/>
+        </w:rPr>
+        <w:t>4</w:t>
+      </w:r>
+      <w:r>
+        <w:rPr>
+          <w:rFonts w:ascii="Consolas" w:eastAsia="Times New Roman" w:hAnsi="Consolas" w:cs="Times New Roman"/>
+          <w:color w:val="BBBEBF"/>
+          <w:kern w:val="0"/>
+          <w:sz w:val="25"/>
+          <w:szCs w:val="25"/>
+          <w14:ligatures w14:val="none"/>
+        </w:rPr>
+        <w:t xml:space="preserve"> </w:t>
+      </w:r>
+      <w:r>
+        <w:rPr>
+          <w:rFonts w:ascii="Consolas" w:eastAsia="Times New Roman" w:hAnsi="Consolas" w:cs="Times New Roman"/>
+          <w:color w:val="8B949E"/>
+          <w:kern w:val="0"/>
+          <w:sz w:val="25"/>
+          <w:szCs w:val="25"/>
+          <w14:ligatures w14:val="none"/>
+        </w:rPr>
+        <w:t xml:space="preserve"># Number of producers </w:t>
+      </w:r>
+    </w:p>
+    <w:p>
+      <w:pPr>
+        <w:pStyle w:val="ListParagraph"/>
         <w:numPr>
           <w:ilvl w:val="0"/>
           <w:numId w:val="2"/>
         </w:numPr>
-        <w:rPr>
-          <w:color w:val="EE0000"/>
-        </w:rPr>
-      </w:pPr>
-      <w:r>
-        <w:rPr>
-          <w:color w:val="EE0000"/>
-        </w:rPr>
-        <w:t xml:space="preserve">TODO6: </w:t>
-      </w:r>
-      <w:r>
-        <w:rPr>
-          <w:color w:val="EE0000"/>
-        </w:rPr>
-        <w:t xml:space="preserve">Write the code with changeability in mind. All such values (number of threads, randomness, number of items, ...) should be easily </w:t>
-      </w:r>
-      <w:proofErr w:type="gramStart"/>
-      <w:r>
-        <w:rPr>
-          <w:color w:val="EE0000"/>
-        </w:rPr>
-        <w:t>changeable</w:t>
-      </w:r>
-      <w:proofErr w:type="gramEnd"/>
-      <w:r>
-        <w:rPr>
-          <w:color w:val="EE0000"/>
-        </w:rPr>
-        <w:t xml:space="preserve"> (e.g. do not use magic numbers). </w:t>
-      </w:r>
-    </w:p>
-    <w:p>
-      <w:pPr>
+        <w:shd w:val="clear" w:color="auto" w:fill="121314"/>
+        <w:spacing w:after="0" w:line="330" w:lineRule="atLeast"/>
+        <w:rPr>
+          <w:rFonts w:ascii="Consolas" w:eastAsia="Times New Roman" w:hAnsi="Consolas" w:cs="Times New Roman"/>
+          <w:color w:val="BBBEBF"/>
+          <w:kern w:val="0"/>
+          <w:sz w:val="25"/>
+          <w:szCs w:val="25"/>
+          <w14:ligatures w14:val="none"/>
+        </w:rPr>
+      </w:pPr>
+      <w:r>
+        <w:rPr>
+          <w:rFonts w:ascii="Consolas" w:eastAsia="Times New Roman" w:hAnsi="Consolas" w:cs="Times New Roman"/>
+          <w:color w:val="79C0FF"/>
+          <w:kern w:val="0"/>
+          <w:sz w:val="25"/>
+          <w:szCs w:val="25"/>
+          <w14:ligatures w14:val="none"/>
+        </w:rPr>
+        <w:t>TOTAL_ITEMS</w:t>
+      </w:r>
+      <w:r>
+        <w:rPr>
+          <w:rFonts w:ascii="Consolas" w:eastAsia="Times New Roman" w:hAnsi="Consolas" w:cs="Times New Roman"/>
+          <w:color w:val="BBBEBF"/>
+          <w:kern w:val="0"/>
+          <w:sz w:val="25"/>
+          <w:szCs w:val="25"/>
+          <w14:ligatures w14:val="none"/>
+        </w:rPr>
+        <w:t xml:space="preserve">: </w:t>
+      </w:r>
+      <w:r>
+        <w:rPr>
+          <w:rFonts w:ascii="Consolas" w:eastAsia="Times New Roman" w:hAnsi="Consolas" w:cs="Times New Roman"/>
+          <w:color w:val="4EC9B0"/>
+          <w:kern w:val="0"/>
+          <w:sz w:val="25"/>
+          <w:szCs w:val="25"/>
+          <w14:ligatures w14:val="none"/>
+        </w:rPr>
+        <w:t>int</w:t>
+      </w:r>
+      <w:r>
+        <w:rPr>
+          <w:rFonts w:ascii="Consolas" w:eastAsia="Times New Roman" w:hAnsi="Consolas" w:cs="Times New Roman"/>
+          <w:color w:val="BBBEBF"/>
+          <w:kern w:val="0"/>
+          <w:sz w:val="25"/>
+          <w:szCs w:val="25"/>
+          <w14:ligatures w14:val="none"/>
+        </w:rPr>
+        <w:t xml:space="preserve"> </w:t>
+      </w:r>
+      <w:r>
+        <w:rPr>
+          <w:rFonts w:ascii="Consolas" w:eastAsia="Times New Roman" w:hAnsi="Consolas" w:cs="Times New Roman"/>
+          <w:color w:val="D4D4D4"/>
+          <w:kern w:val="0"/>
+          <w:sz w:val="25"/>
+          <w:szCs w:val="25"/>
+          <w14:ligatures w14:val="none"/>
+        </w:rPr>
+        <w:t>=</w:t>
+      </w:r>
+      <w:r>
+        <w:rPr>
+          <w:rFonts w:ascii="Consolas" w:eastAsia="Times New Roman" w:hAnsi="Consolas" w:cs="Times New Roman"/>
+          <w:color w:val="BBBEBF"/>
+          <w:kern w:val="0"/>
+          <w:sz w:val="25"/>
+          <w:szCs w:val="25"/>
+          <w14:ligatures w14:val="none"/>
+        </w:rPr>
+        <w:t xml:space="preserve"> </w:t>
+      </w:r>
+      <w:r>
+        <w:rPr>
+          <w:rFonts w:ascii="Consolas" w:eastAsia="Times New Roman" w:hAnsi="Consolas" w:cs="Times New Roman"/>
+          <w:color w:val="B5CEA8"/>
+          <w:kern w:val="0"/>
+          <w:sz w:val="25"/>
+          <w:szCs w:val="25"/>
+          <w14:ligatures w14:val="none"/>
+        </w:rPr>
+        <w:t>20</w:t>
+      </w:r>
+      <w:r>
+        <w:rPr>
+          <w:rFonts w:ascii="Consolas" w:eastAsia="Times New Roman" w:hAnsi="Consolas" w:cs="Times New Roman"/>
+          <w:color w:val="BBBEBF"/>
+          <w:kern w:val="0"/>
+          <w:sz w:val="25"/>
+          <w:szCs w:val="25"/>
+          <w14:ligatures w14:val="none"/>
+        </w:rPr>
+        <w:t xml:space="preserve">           </w:t>
+      </w:r>
+      <w:r>
+        <w:rPr>
+          <w:rFonts w:ascii="Consolas" w:eastAsia="Times New Roman" w:hAnsi="Consolas" w:cs="Times New Roman"/>
+          <w:color w:val="8B949E"/>
+          <w:kern w:val="0"/>
+          <w:sz w:val="25"/>
+          <w:szCs w:val="25"/>
+          <w14:ligatures w14:val="none"/>
+        </w:rPr>
+        <w:t># Total number of items to be produced (must be &gt;= NUMBER_OF_PRODUCERS)</w:t>
+      </w:r>
+    </w:p>
+    <w:p>
+      <w:pPr>
+        <w:pStyle w:val="ListParagraph"/>
         <w:numPr>
           <w:ilvl w:val="0"/>
           <w:numId w:val="2"/>
         </w:numPr>
-        <w:rPr>
-          <w:color w:val="EE0000"/>
-        </w:rPr>
-      </w:pPr>
-      <w:r>
-        <w:rPr>
-          <w:color w:val="EE0000"/>
-        </w:rPr>
-        <w:t xml:space="preserve">TODO7: </w:t>
-      </w:r>
-      <w:r>
-        <w:rPr>
-          <w:color w:val="EE0000"/>
-        </w:rPr>
-        <w:t>The program should gracefully end when all produced items are consumed. Consumer threads can be daemon threads (for simplicity), but as usual you need to explain and document your choice. </w:t>
-      </w:r>
-    </w:p>
-    <w:p>
-      <w:pPr>
+        <w:shd w:val="clear" w:color="auto" w:fill="121314"/>
+        <w:spacing w:after="0" w:line="330" w:lineRule="atLeast"/>
+        <w:rPr>
+          <w:rFonts w:ascii="Consolas" w:eastAsia="Times New Roman" w:hAnsi="Consolas" w:cs="Times New Roman"/>
+          <w:color w:val="BBBEBF"/>
+          <w:kern w:val="0"/>
+          <w:sz w:val="25"/>
+          <w:szCs w:val="25"/>
+          <w14:ligatures w14:val="none"/>
+        </w:rPr>
+      </w:pPr>
+      <w:r>
+        <w:rPr>
+          <w:rFonts w:ascii="Consolas" w:eastAsia="Times New Roman" w:hAnsi="Consolas" w:cs="Times New Roman"/>
+          <w:color w:val="79C0FF"/>
+          <w:kern w:val="0"/>
+          <w:sz w:val="25"/>
+          <w:szCs w:val="25"/>
+          <w14:ligatures w14:val="none"/>
+        </w:rPr>
+        <w:t>RANDOM_PRODUCER_SLEEP</w:t>
+      </w:r>
+      <w:r>
+        <w:rPr>
+          <w:rFonts w:ascii="Consolas" w:eastAsia="Times New Roman" w:hAnsi="Consolas" w:cs="Times New Roman"/>
+          <w:color w:val="BBBEBF"/>
+          <w:kern w:val="0"/>
+          <w:sz w:val="25"/>
+          <w:szCs w:val="25"/>
+          <w14:ligatures w14:val="none"/>
+        </w:rPr>
+        <w:t xml:space="preserve">: </w:t>
+      </w:r>
+      <w:r>
+        <w:rPr>
+          <w:rFonts w:ascii="Consolas" w:eastAsia="Times New Roman" w:hAnsi="Consolas" w:cs="Times New Roman"/>
+          <w:color w:val="4EC9B0"/>
+          <w:kern w:val="0"/>
+          <w:sz w:val="25"/>
+          <w:szCs w:val="25"/>
+          <w14:ligatures w14:val="none"/>
+        </w:rPr>
+        <w:t>tuple</w:t>
+      </w:r>
+      <w:r>
+        <w:rPr>
+          <w:rFonts w:ascii="Consolas" w:eastAsia="Times New Roman" w:hAnsi="Consolas" w:cs="Times New Roman"/>
+          <w:color w:val="BBBEBF"/>
+          <w:kern w:val="0"/>
+          <w:sz w:val="25"/>
+          <w:szCs w:val="25"/>
+          <w14:ligatures w14:val="none"/>
+        </w:rPr>
+        <w:t>[</w:t>
+      </w:r>
+      <w:r>
+        <w:rPr>
+          <w:rFonts w:ascii="Consolas" w:eastAsia="Times New Roman" w:hAnsi="Consolas" w:cs="Times New Roman"/>
+          <w:color w:val="4EC9B0"/>
+          <w:kern w:val="0"/>
+          <w:sz w:val="25"/>
+          <w:szCs w:val="25"/>
+          <w14:ligatures w14:val="none"/>
+        </w:rPr>
+        <w:t>float</w:t>
+      </w:r>
+      <w:r>
+        <w:rPr>
+          <w:rFonts w:ascii="Consolas" w:eastAsia="Times New Roman" w:hAnsi="Consolas" w:cs="Times New Roman"/>
+          <w:color w:val="BBBEBF"/>
+          <w:kern w:val="0"/>
+          <w:sz w:val="25"/>
+          <w:szCs w:val="25"/>
+          <w14:ligatures w14:val="none"/>
+        </w:rPr>
+        <w:t xml:space="preserve">, </w:t>
+      </w:r>
+      <w:r>
+        <w:rPr>
+          <w:rFonts w:ascii="Consolas" w:eastAsia="Times New Roman" w:hAnsi="Consolas" w:cs="Times New Roman"/>
+          <w:color w:val="4EC9B0"/>
+          <w:kern w:val="0"/>
+          <w:sz w:val="25"/>
+          <w:szCs w:val="25"/>
+          <w14:ligatures w14:val="none"/>
+        </w:rPr>
+        <w:t>float</w:t>
+      </w:r>
+      <w:r>
+        <w:rPr>
+          <w:rFonts w:ascii="Consolas" w:eastAsia="Times New Roman" w:hAnsi="Consolas" w:cs="Times New Roman"/>
+          <w:color w:val="BBBEBF"/>
+          <w:kern w:val="0"/>
+          <w:sz w:val="25"/>
+          <w:szCs w:val="25"/>
+          <w14:ligatures w14:val="none"/>
+        </w:rPr>
+        <w:t xml:space="preserve">] </w:t>
+      </w:r>
+      <w:r>
+        <w:rPr>
+          <w:rFonts w:ascii="Consolas" w:eastAsia="Times New Roman" w:hAnsi="Consolas" w:cs="Times New Roman"/>
+          <w:color w:val="D4D4D4"/>
+          <w:kern w:val="0"/>
+          <w:sz w:val="25"/>
+          <w:szCs w:val="25"/>
+          <w14:ligatures w14:val="none"/>
+        </w:rPr>
+        <w:t>=</w:t>
+      </w:r>
+      <w:r>
+        <w:rPr>
+          <w:rFonts w:ascii="Consolas" w:eastAsia="Times New Roman" w:hAnsi="Consolas" w:cs="Times New Roman"/>
+          <w:color w:val="BBBEBF"/>
+          <w:kern w:val="0"/>
+          <w:sz w:val="25"/>
+          <w:szCs w:val="25"/>
+          <w14:ligatures w14:val="none"/>
+        </w:rPr>
+        <w:t xml:space="preserve"> (</w:t>
+      </w:r>
+      <w:r>
+        <w:rPr>
+          <w:rFonts w:ascii="Consolas" w:eastAsia="Times New Roman" w:hAnsi="Consolas" w:cs="Times New Roman"/>
+          <w:color w:val="B5CEA8"/>
+          <w:kern w:val="0"/>
+          <w:sz w:val="25"/>
+          <w:szCs w:val="25"/>
+          <w14:ligatures w14:val="none"/>
+        </w:rPr>
+        <w:t>0.1</w:t>
+      </w:r>
+      <w:r>
+        <w:rPr>
+          <w:rFonts w:ascii="Consolas" w:eastAsia="Times New Roman" w:hAnsi="Consolas" w:cs="Times New Roman"/>
+          <w:color w:val="BBBEBF"/>
+          <w:kern w:val="0"/>
+          <w:sz w:val="25"/>
+          <w:szCs w:val="25"/>
+          <w14:ligatures w14:val="none"/>
+        </w:rPr>
+        <w:t xml:space="preserve">, </w:t>
+      </w:r>
+      <w:r>
+        <w:rPr>
+          <w:rFonts w:ascii="Consolas" w:eastAsia="Times New Roman" w:hAnsi="Consolas" w:cs="Times New Roman"/>
+          <w:color w:val="B5CEA8"/>
+          <w:kern w:val="0"/>
+          <w:sz w:val="25"/>
+          <w:szCs w:val="25"/>
+          <w14:ligatures w14:val="none"/>
+        </w:rPr>
+        <w:t>0.5</w:t>
+      </w:r>
+      <w:r>
+        <w:rPr>
+          <w:rFonts w:ascii="Consolas" w:eastAsia="Times New Roman" w:hAnsi="Consolas" w:cs="Times New Roman"/>
+          <w:color w:val="BBBEBF"/>
+          <w:kern w:val="0"/>
+          <w:sz w:val="25"/>
+          <w:szCs w:val="25"/>
+          <w14:ligatures w14:val="none"/>
+        </w:rPr>
+        <w:t xml:space="preserve">) </w:t>
+      </w:r>
+      <w:r>
+        <w:rPr>
+          <w:rFonts w:ascii="Consolas" w:eastAsia="Times New Roman" w:hAnsi="Consolas" w:cs="Times New Roman"/>
+          <w:color w:val="8B949E"/>
+          <w:kern w:val="0"/>
+          <w:sz w:val="25"/>
+          <w:szCs w:val="25"/>
+          <w14:ligatures w14:val="none"/>
+        </w:rPr>
+        <w:t># seconds for random sleep range for producers</w:t>
+      </w:r>
+    </w:p>
+    <w:p>
+      <w:pPr>
+        <w:pStyle w:val="ListParagraph"/>
         <w:numPr>
           <w:ilvl w:val="0"/>
           <w:numId w:val="2"/>
         </w:numPr>
+        <w:shd w:val="clear" w:color="auto" w:fill="121314"/>
+        <w:spacing w:after="0" w:line="330" w:lineRule="atLeast"/>
+        <w:rPr>
+          <w:rFonts w:ascii="Consolas" w:eastAsia="Times New Roman" w:hAnsi="Consolas" w:cs="Times New Roman"/>
+          <w:color w:val="BBBEBF"/>
+          <w:kern w:val="0"/>
+          <w:sz w:val="25"/>
+          <w:szCs w:val="25"/>
+          <w14:ligatures w14:val="none"/>
+        </w:rPr>
+      </w:pPr>
+      <w:r>
+        <w:rPr>
+          <w:rFonts w:ascii="Consolas" w:eastAsia="Times New Roman" w:hAnsi="Consolas" w:cs="Times New Roman"/>
+          <w:color w:val="79C0FF"/>
+          <w:kern w:val="0"/>
+          <w:sz w:val="25"/>
+          <w:szCs w:val="25"/>
+          <w14:ligatures w14:val="none"/>
+        </w:rPr>
+        <w:t>RANDOM_CONSUMER_SLEEP</w:t>
+      </w:r>
+      <w:r>
+        <w:rPr>
+          <w:rFonts w:ascii="Consolas" w:eastAsia="Times New Roman" w:hAnsi="Consolas" w:cs="Times New Roman"/>
+          <w:color w:val="BBBEBF"/>
+          <w:kern w:val="0"/>
+          <w:sz w:val="25"/>
+          <w:szCs w:val="25"/>
+          <w14:ligatures w14:val="none"/>
+        </w:rPr>
+        <w:t xml:space="preserve">: </w:t>
+      </w:r>
+      <w:r>
+        <w:rPr>
+          <w:rFonts w:ascii="Consolas" w:eastAsia="Times New Roman" w:hAnsi="Consolas" w:cs="Times New Roman"/>
+          <w:color w:val="4EC9B0"/>
+          <w:kern w:val="0"/>
+          <w:sz w:val="25"/>
+          <w:szCs w:val="25"/>
+          <w14:ligatures w14:val="none"/>
+        </w:rPr>
+        <w:t>tuple</w:t>
+      </w:r>
+      <w:r>
+        <w:rPr>
+          <w:rFonts w:ascii="Consolas" w:eastAsia="Times New Roman" w:hAnsi="Consolas" w:cs="Times New Roman"/>
+          <w:color w:val="BBBEBF"/>
+          <w:kern w:val="0"/>
+          <w:sz w:val="25"/>
+          <w:szCs w:val="25"/>
+          <w14:ligatures w14:val="none"/>
+        </w:rPr>
+        <w:t>[</w:t>
+      </w:r>
+      <w:r>
+        <w:rPr>
+          <w:rFonts w:ascii="Consolas" w:eastAsia="Times New Roman" w:hAnsi="Consolas" w:cs="Times New Roman"/>
+          <w:color w:val="4EC9B0"/>
+          <w:kern w:val="0"/>
+          <w:sz w:val="25"/>
+          <w:szCs w:val="25"/>
+          <w14:ligatures w14:val="none"/>
+        </w:rPr>
+        <w:t>float</w:t>
+      </w:r>
+      <w:r>
+        <w:rPr>
+          <w:rFonts w:ascii="Consolas" w:eastAsia="Times New Roman" w:hAnsi="Consolas" w:cs="Times New Roman"/>
+          <w:color w:val="BBBEBF"/>
+          <w:kern w:val="0"/>
+          <w:sz w:val="25"/>
+          <w:szCs w:val="25"/>
+          <w14:ligatures w14:val="none"/>
+        </w:rPr>
+        <w:t xml:space="preserve">, </w:t>
+      </w:r>
+      <w:r>
+        <w:rPr>
+          <w:rFonts w:ascii="Consolas" w:eastAsia="Times New Roman" w:hAnsi="Consolas" w:cs="Times New Roman"/>
+          <w:color w:val="4EC9B0"/>
+          <w:kern w:val="0"/>
+          <w:sz w:val="25"/>
+          <w:szCs w:val="25"/>
+          <w14:ligatures w14:val="none"/>
+        </w:rPr>
+        <w:t>float</w:t>
+      </w:r>
+      <w:r>
+        <w:rPr>
+          <w:rFonts w:ascii="Consolas" w:eastAsia="Times New Roman" w:hAnsi="Consolas" w:cs="Times New Roman"/>
+          <w:color w:val="BBBEBF"/>
+          <w:kern w:val="0"/>
+          <w:sz w:val="25"/>
+          <w:szCs w:val="25"/>
+          <w14:ligatures w14:val="none"/>
+        </w:rPr>
+        <w:t xml:space="preserve">] </w:t>
+      </w:r>
+      <w:r>
+        <w:rPr>
+          <w:rFonts w:ascii="Consolas" w:eastAsia="Times New Roman" w:hAnsi="Consolas" w:cs="Times New Roman"/>
+          <w:color w:val="D4D4D4"/>
+          <w:kern w:val="0"/>
+          <w:sz w:val="25"/>
+          <w:szCs w:val="25"/>
+          <w14:ligatures w14:val="none"/>
+        </w:rPr>
+        <w:t>=</w:t>
+      </w:r>
+      <w:r>
+        <w:rPr>
+          <w:rFonts w:ascii="Consolas" w:eastAsia="Times New Roman" w:hAnsi="Consolas" w:cs="Times New Roman"/>
+          <w:color w:val="BBBEBF"/>
+          <w:kern w:val="0"/>
+          <w:sz w:val="25"/>
+          <w:szCs w:val="25"/>
+          <w14:ligatures w14:val="none"/>
+        </w:rPr>
+        <w:t xml:space="preserve"> (</w:t>
+      </w:r>
+      <w:r>
+        <w:rPr>
+          <w:rFonts w:ascii="Consolas" w:eastAsia="Times New Roman" w:hAnsi="Consolas" w:cs="Times New Roman"/>
+          <w:color w:val="B5CEA8"/>
+          <w:kern w:val="0"/>
+          <w:sz w:val="25"/>
+          <w:szCs w:val="25"/>
+          <w14:ligatures w14:val="none"/>
+        </w:rPr>
+        <w:t>0.1</w:t>
+      </w:r>
+      <w:r>
+        <w:rPr>
+          <w:rFonts w:ascii="Consolas" w:eastAsia="Times New Roman" w:hAnsi="Consolas" w:cs="Times New Roman"/>
+          <w:color w:val="BBBEBF"/>
+          <w:kern w:val="0"/>
+          <w:sz w:val="25"/>
+          <w:szCs w:val="25"/>
+          <w14:ligatures w14:val="none"/>
+        </w:rPr>
+        <w:t xml:space="preserve">, </w:t>
+      </w:r>
+      <w:r>
+        <w:rPr>
+          <w:rFonts w:ascii="Consolas" w:eastAsia="Times New Roman" w:hAnsi="Consolas" w:cs="Times New Roman"/>
+          <w:color w:val="B5CEA8"/>
+          <w:kern w:val="0"/>
+          <w:sz w:val="25"/>
+          <w:szCs w:val="25"/>
+          <w14:ligatures w14:val="none"/>
+        </w:rPr>
+        <w:t>0.5</w:t>
+      </w:r>
+      <w:r>
+        <w:rPr>
+          <w:rFonts w:ascii="Consolas" w:eastAsia="Times New Roman" w:hAnsi="Consolas" w:cs="Times New Roman"/>
+          <w:color w:val="BBBEBF"/>
+          <w:kern w:val="0"/>
+          <w:sz w:val="25"/>
+          <w:szCs w:val="25"/>
+          <w14:ligatures w14:val="none"/>
+        </w:rPr>
+        <w:t xml:space="preserve">) </w:t>
+      </w:r>
+      <w:r>
+        <w:rPr>
+          <w:rFonts w:ascii="Consolas" w:eastAsia="Times New Roman" w:hAnsi="Consolas" w:cs="Times New Roman"/>
+          <w:color w:val="8B949E"/>
+          <w:kern w:val="0"/>
+          <w:sz w:val="25"/>
+          <w:szCs w:val="25"/>
+          <w14:ligatures w14:val="none"/>
+        </w:rPr>
+        <w:t># seconds for random sleep range for consumers</w:t>
+      </w:r>
+    </w:p>
+    <w:p/>
+    <w:p>
+      <w:pPr>
+        <w:pStyle w:val="Heading2"/>
+        <w:numPr>
+          <w:ilvl w:val="0"/>
+          <w:numId w:val="5"/>
+        </w:numPr>
+      </w:pPr>
+      <w:r>
+        <w:t>Methods/UML</w:t>
+      </w:r>
+    </w:p>
+    <w:p>
+      <w:pPr>
+        <w:pStyle w:val="Heading2"/>
+        <w:numPr>
+          <w:ilvl w:val="0"/>
+          <w:numId w:val="5"/>
+        </w:numPr>
+      </w:pPr>
+      <w:r>
+        <w:t>Challenges/Issues</w:t>
+      </w:r>
+    </w:p>
+    <w:p/>
+    <w:p>
+      <w:r>
+        <w:t>Talk about how it has easy to change variables and what each does</w:t>
+      </w:r>
+    </w:p>
+    <w:p>
+      <w:pPr>
+        <w:numPr>
+          <w:ilvl w:val="0"/>
+          <w:numId w:val="2"/>
+        </w:numPr>
         <w:rPr>
           <w:color w:val="EE0000"/>
         </w:rPr>
@@ -480,77 +1528,150 @@
         <w:rPr>
           <w:color w:val="EE0000"/>
         </w:rPr>
-        <w:t xml:space="preserve">TODO8: </w:t>
+        <w:lastRenderedPageBreak/>
+        <w:t xml:space="preserve">TODO6: </w:t>
       </w:r>
       <w:r>
         <w:rPr>
           <w:color w:val="EE0000"/>
         </w:rPr>
-        <w:t>Fully document your code as usual (</w:t>
-      </w:r>
-      <w:proofErr w:type="gramStart"/>
-      <w:r>
+        <w:t>Write the code with changeability in mind. All such values (number of threads, randomness, number of items, ...) should be easily changeable (e.g. do not use magic numbers). </w:t>
+      </w:r>
+    </w:p>
+    <w:p/>
+    <w:p>
+      <w:r>
+        <w:t>Used code skeleton and did not add any type or methods to be passed into it</w:t>
+      </w:r>
+    </w:p>
+    <w:p>
+      <w:r>
+        <w:t>Added a method to calculate how many items each producer produces</w:t>
+      </w:r>
+    </w:p>
+    <w:p>
+      <w:r>
+        <w:t>Was difficult to find a satisfying way to have a total number of items produced done</w:t>
+      </w:r>
+    </w:p>
+    <w:p>
+      <w:pPr>
+        <w:numPr>
+          <w:ilvl w:val="0"/>
+          <w:numId w:val="2"/>
+        </w:numPr>
         <w:rPr>
           <w:color w:val="EE0000"/>
         </w:rPr>
-        <w:t>that is</w:t>
-      </w:r>
-      <w:proofErr w:type="gramEnd"/>
+      </w:pPr>
       <w:r>
         <w:rPr>
           <w:color w:val="EE0000"/>
         </w:rPr>
-        <w:t xml:space="preserve"> </w:t>
-      </w:r>
-      <w:proofErr w:type="gramStart"/>
+        <w:t xml:space="preserve">TODO2: </w:t>
+      </w:r>
       <w:r>
         <w:rPr>
           <w:color w:val="EE0000"/>
         </w:rPr>
-        <w:t>include</w:t>
-      </w:r>
-      <w:proofErr w:type="gramEnd"/>
-      <w:r>
-        <w:rPr>
-          <w:color w:val="EE0000"/>
-        </w:rPr>
-        <w:t xml:space="preserve"> comments, docstrings for every method or type, type hints, ...).</w:t>
-      </w:r>
-    </w:p>
-    <w:p>
-      <w:pPr>
-        <w:rPr>
-          <w:color w:val="EE0000"/>
-        </w:rPr>
-      </w:pPr>
+        <w:t>Do not use any other synchronization primitive (lock, semaphore, ...), or buffering structure (circular buffer, ...).</w:t>
+      </w:r>
+    </w:p>
+    <w:p>
+      <w:r>
+        <w:t xml:space="preserve">With another queue, could very easily have a </w:t>
+      </w:r>
+      <w:proofErr w:type="spellStart"/>
+      <w:r>
+        <w:t>non calculated</w:t>
+      </w:r>
+      <w:proofErr w:type="spellEnd"/>
+      <w:r>
+        <w:t xml:space="preserve"> way of</w:t>
+      </w:r>
+      <w:r>
+        <w:t xml:space="preserve"> having all producers randomly add to that total number of produced items</w:t>
+      </w:r>
+    </w:p>
+    <w:p>
+      <w:r>
+        <w:t>Instead required that method as a workaround which was one problem to overcome</w:t>
+      </w:r>
+    </w:p>
+    <w:p>
+      <w:r>
+        <w:t>All producers have a join to make sure they finish</w:t>
+      </w:r>
+    </w:p>
+    <w:p>
+      <w:r>
+        <w:t>All consumers are demonic but the buffer queue has a wait check to make sure it has been emptied.</w:t>
+      </w:r>
+    </w:p>
+    <w:p>
+      <w:r>
+        <w:tab/>
+        <w:t>Could have alternatively just had each consumer constantly check until producers were done and then started ending when the queue had no items left</w:t>
+      </w:r>
     </w:p>
     <w:p/>
     <w:p>
       <w:r>
-        <w:t>TD</w:t>
-      </w:r>
-    </w:p>
-    <w:p>
-      <w:r>
-        <w:br w:type="page"/>
-      </w:r>
-    </w:p>
-    <w:p>
-      <w:r>
-        <w:lastRenderedPageBreak/>
-        <w:t>Group #: B21</w:t>
-      </w:r>
-    </w:p>
-    <w:p>
-      <w:r>
-        <w:t>Student names: Anna Bartl and Conor O'Neill</w:t>
-      </w:r>
-    </w:p>
-    <w:p>
-      <w:r>
-        <w:t>TD</w:t>
-      </w:r>
-    </w:p>
+        <w:t>Add UML for:</w:t>
+      </w:r>
+    </w:p>
+    <w:p>
+      <w:pPr>
+        <w:pStyle w:val="ListParagraph"/>
+        <w:numPr>
+          <w:ilvl w:val="0"/>
+          <w:numId w:val="4"/>
+        </w:numPr>
+      </w:pPr>
+      <w:r>
+        <w:t>Producer</w:t>
+      </w:r>
+    </w:p>
+    <w:p>
+      <w:pPr>
+        <w:pStyle w:val="ListParagraph"/>
+        <w:numPr>
+          <w:ilvl w:val="1"/>
+          <w:numId w:val="4"/>
+        </w:numPr>
+      </w:pPr>
+      <w:r>
+        <w:t>Helper function</w:t>
+      </w:r>
+    </w:p>
+    <w:p>
+      <w:pPr>
+        <w:pStyle w:val="ListParagraph"/>
+        <w:numPr>
+          <w:ilvl w:val="0"/>
+          <w:numId w:val="4"/>
+        </w:numPr>
+      </w:pPr>
+      <w:r>
+        <w:t>Consumer</w:t>
+      </w:r>
+    </w:p>
+    <w:p>
+      <w:r>
+        <w:t>Diagram for how the code runs</w:t>
+      </w:r>
+    </w:p>
+    <w:p>
+      <w:r>
+        <w:t>Diagram for how it gracefully ends</w:t>
+      </w:r>
+    </w:p>
+    <w:p>
+      <w:r>
+        <w:t>Maybe something about the FIFO queue visualization</w:t>
+      </w:r>
+    </w:p>
+    <w:p/>
     <w:sectPr>
       <w:pgSz w:w="12240" w:h="15840"/>
       <w:pgMar w:top="1440" w:right="1440" w:bottom="1440" w:left="1440" w:header="720" w:footer="720" w:gutter="0"/>
@@ -564,6 +1685,118 @@
 <file path=word/numbering.xml><?xml version="1.0" encoding="utf-8"?>
 <w:numbering xmlns:wpc="http://schemas.microsoft.com/office/word/2010/wordprocessingCanvas" xmlns:cx="http://schemas.microsoft.com/office/drawing/2014/chartex" xmlns:cx1="http://schemas.microsoft.com/office/drawing/2015/9/8/chartex" xmlns:cx2="http://schemas.microsoft.com/office/drawing/2015/10/21/chartex" xmlns:cx3="http://schemas.microsoft.com/office/drawing/2016/5/9/chartex" xmlns:cx4="http://schemas.microsoft.com/office/drawing/2016/5/10/chartex" xmlns:cx5="http://schemas.microsoft.com/office/drawing/2016/5/11/chartex" xmlns:cx6="http://schemas.microsoft.com/office/drawing/2016/5/12/chartex" xmlns:cx7="http://schemas.microsoft.com/office/drawing/2016/5/13/chartex" xmlns:cx8="http://schemas.microsoft.com/office/drawing/2016/5/14/chartex" xmlns:mc="http://schemas.openxmlformats.org/markup-compatibility/2006" xmlns:aink="http://schemas.microsoft.com/office/drawing/2016/ink" xmlns:am3d="http://schemas.microsoft.com/office/drawing/2017/model3d" xmlns:o="urn:schemas-microsoft-com:office:office" xmlns:oel="http://schemas.microsoft.com/office/2019/extlst" xmlns:r="http://schemas.openxmlformats.org/officeDocument/2006/relationships" xmlns:m="http://schemas.openxmlformats.org/officeDocument/2006/math" xmlns:v="urn:schemas-microsoft-com:vml" xmlns:wp14="http://schemas.microsoft.com/office/word/2010/wordprocessingDrawing" xmlns:wp="http://schemas.openxmlformats.org/drawingml/2006/wordprocessingDrawing" xmlns:w10="urn:schemas-microsoft-com:office:word" xmlns:w="http://schemas.openxmlformats.org/wordprocessingml/2006/main" xmlns:w14="http://schemas.microsoft.com/office/word/2010/wordml" xmlns:w15="http://schemas.microsoft.com/office/word/2012/wordml" xmlns:w16cex="http://schemas.microsoft.com/office/word/2018/wordml/cex" xmlns:w16cid="http://schemas.microsoft.com/office/word/2016/wordml/cid" xmlns:w16="http://schemas.microsoft.com/office/word/2018/wordml" xmlns:w16du="http://schemas.microsoft.com/office/word/2023/wordml/word16du" xmlns:w16sdtdh="http://schemas.microsoft.com/office/word/2020/wordml/sdtdatahash" xmlns:w16sdtfl="http://schemas.microsoft.com/office/word/2024/wordml/sdtformatlock" xmlns:w16se="http://schemas.microsoft.com/office/word/2015/wordml/symex" xmlns:wpg="http://schemas.microsoft.com/office/word/2010/wordprocessingGroup" xmlns:wpi="http://schemas.microsoft.com/office/word/2010/wordprocessingInk" xmlns:wne="http://schemas.microsoft.com/office/word/2006/wordml" xmlns:wps="http://schemas.microsoft.com/office/word/2010/wordprocessingShape" mc:Ignorable="w14 w15 w16se w16cid w16 w16cex w16sdtdh w16sdtfl w16du wp14">
   <w:abstractNum w:abstractNumId="0" w15:restartNumberingAfterBreak="0">
+    <w:nsid w:val="21C826C0"/>
+    <w:multiLevelType w:val="hybridMultilevel"/>
+    <w:tmpl w:val="8CCA858A"/>
+    <w:lvl w:ilvl="0" w:tplc="9418FD7E">
+      <w:numFmt w:val="bullet"/>
+      <w:lvlText w:val="-"/>
+      <w:lvlJc w:val="left"/>
+      <w:pPr>
+        <w:ind w:left="720" w:hanging="360"/>
+      </w:pPr>
+      <w:rPr>
+        <w:rFonts w:ascii="Aptos" w:eastAsiaTheme="minorHAnsi" w:hAnsi="Aptos" w:cstheme="minorBidi" w:hint="default"/>
+      </w:rPr>
+    </w:lvl>
+    <w:lvl w:ilvl="1" w:tplc="04090003">
+      <w:start w:val="1"/>
+      <w:numFmt w:val="bullet"/>
+      <w:lvlText w:val="o"/>
+      <w:lvlJc w:val="left"/>
+      <w:pPr>
+        <w:ind w:left="1440" w:hanging="360"/>
+      </w:pPr>
+      <w:rPr>
+        <w:rFonts w:ascii="Courier New" w:hAnsi="Courier New" w:cs="Courier New" w:hint="default"/>
+      </w:rPr>
+    </w:lvl>
+    <w:lvl w:ilvl="2" w:tplc="04090005" w:tentative="1">
+      <w:start w:val="1"/>
+      <w:numFmt w:val="bullet"/>
+      <w:lvlText w:val=""/>
+      <w:lvlJc w:val="left"/>
+      <w:pPr>
+        <w:ind w:left="2160" w:hanging="360"/>
+      </w:pPr>
+      <w:rPr>
+        <w:rFonts w:ascii="Wingdings" w:hAnsi="Wingdings" w:hint="default"/>
+      </w:rPr>
+    </w:lvl>
+    <w:lvl w:ilvl="3" w:tplc="04090001" w:tentative="1">
+      <w:start w:val="1"/>
+      <w:numFmt w:val="bullet"/>
+      <w:lvlText w:val=""/>
+      <w:lvlJc w:val="left"/>
+      <w:pPr>
+        <w:ind w:left="2880" w:hanging="360"/>
+      </w:pPr>
+      <w:rPr>
+        <w:rFonts w:ascii="Symbol" w:hAnsi="Symbol" w:hint="default"/>
+      </w:rPr>
+    </w:lvl>
+    <w:lvl w:ilvl="4" w:tplc="04090003" w:tentative="1">
+      <w:start w:val="1"/>
+      <w:numFmt w:val="bullet"/>
+      <w:lvlText w:val="o"/>
+      <w:lvlJc w:val="left"/>
+      <w:pPr>
+        <w:ind w:left="3600" w:hanging="360"/>
+      </w:pPr>
+      <w:rPr>
+        <w:rFonts w:ascii="Courier New" w:hAnsi="Courier New" w:cs="Courier New" w:hint="default"/>
+      </w:rPr>
+    </w:lvl>
+    <w:lvl w:ilvl="5" w:tplc="04090005" w:tentative="1">
+      <w:start w:val="1"/>
+      <w:numFmt w:val="bullet"/>
+      <w:lvlText w:val=""/>
+      <w:lvlJc w:val="left"/>
+      <w:pPr>
+        <w:ind w:left="4320" w:hanging="360"/>
+      </w:pPr>
+      <w:rPr>
+        <w:rFonts w:ascii="Wingdings" w:hAnsi="Wingdings" w:hint="default"/>
+      </w:rPr>
+    </w:lvl>
+    <w:lvl w:ilvl="6" w:tplc="04090001" w:tentative="1">
+      <w:start w:val="1"/>
+      <w:numFmt w:val="bullet"/>
+      <w:lvlText w:val=""/>
+      <w:lvlJc w:val="left"/>
+      <w:pPr>
+        <w:ind w:left="5040" w:hanging="360"/>
+      </w:pPr>
+      <w:rPr>
+        <w:rFonts w:ascii="Symbol" w:hAnsi="Symbol" w:hint="default"/>
+      </w:rPr>
+    </w:lvl>
+    <w:lvl w:ilvl="7" w:tplc="04090003" w:tentative="1">
+      <w:start w:val="1"/>
+      <w:numFmt w:val="bullet"/>
+      <w:lvlText w:val="o"/>
+      <w:lvlJc w:val="left"/>
+      <w:pPr>
+        <w:ind w:left="5760" w:hanging="360"/>
+      </w:pPr>
+      <w:rPr>
+        <w:rFonts w:ascii="Courier New" w:hAnsi="Courier New" w:cs="Courier New" w:hint="default"/>
+      </w:rPr>
+    </w:lvl>
+    <w:lvl w:ilvl="8" w:tplc="04090005" w:tentative="1">
+      <w:start w:val="1"/>
+      <w:numFmt w:val="bullet"/>
+      <w:lvlText w:val=""/>
+      <w:lvlJc w:val="left"/>
+      <w:pPr>
+        <w:ind w:left="6480" w:hanging="360"/>
+      </w:pPr>
+      <w:rPr>
+        <w:rFonts w:ascii="Wingdings" w:hAnsi="Wingdings" w:hint="default"/>
+      </w:rPr>
+    </w:lvl>
+  </w:abstractNum>
+  <w:abstractNum w:abstractNumId="1" w15:restartNumberingAfterBreak="0">
     <w:nsid w:val="23996A57"/>
     <w:multiLevelType w:val="hybridMultilevel"/>
     <w:tmpl w:val="B3542130"/>
@@ -676,7 +1909,128 @@
       </w:rPr>
     </w:lvl>
   </w:abstractNum>
-  <w:abstractNum w:abstractNumId="1" w15:restartNumberingAfterBreak="0">
+  <w:abstractNum w:abstractNumId="2" w15:restartNumberingAfterBreak="0">
+    <w:nsid w:val="654A2658"/>
+    <w:multiLevelType w:val="multilevel"/>
+    <w:tmpl w:val="414A1438"/>
+    <w:lvl w:ilvl="0">
+      <w:start w:val="1"/>
+      <w:numFmt w:val="decimal"/>
+      <w:lvlText w:val="%1."/>
+      <w:lvlJc w:val="left"/>
+      <w:pPr>
+        <w:ind w:left="720" w:hanging="360"/>
+      </w:pPr>
+      <w:rPr>
+        <w:rFonts w:hint="default"/>
+      </w:rPr>
+    </w:lvl>
+    <w:lvl w:ilvl="1">
+      <w:start w:val="1"/>
+      <w:numFmt w:val="decimal"/>
+      <w:isLgl/>
+      <w:lvlText w:val="%1.%2"/>
+      <w:lvlJc w:val="left"/>
+      <w:pPr>
+        <w:ind w:left="795" w:hanging="435"/>
+      </w:pPr>
+      <w:rPr>
+        <w:rFonts w:hint="default"/>
+      </w:rPr>
+    </w:lvl>
+    <w:lvl w:ilvl="2">
+      <w:start w:val="1"/>
+      <w:numFmt w:val="decimal"/>
+      <w:isLgl/>
+      <w:lvlText w:val="%1.%2.%3"/>
+      <w:lvlJc w:val="left"/>
+      <w:pPr>
+        <w:ind w:left="1080" w:hanging="720"/>
+      </w:pPr>
+      <w:rPr>
+        <w:rFonts w:hint="default"/>
+      </w:rPr>
+    </w:lvl>
+    <w:lvl w:ilvl="3">
+      <w:start w:val="1"/>
+      <w:numFmt w:val="decimal"/>
+      <w:isLgl/>
+      <w:lvlText w:val="%1.%2.%3.%4"/>
+      <w:lvlJc w:val="left"/>
+      <w:pPr>
+        <w:ind w:left="1440" w:hanging="1080"/>
+      </w:pPr>
+      <w:rPr>
+        <w:rFonts w:hint="default"/>
+      </w:rPr>
+    </w:lvl>
+    <w:lvl w:ilvl="4">
+      <w:start w:val="1"/>
+      <w:numFmt w:val="decimal"/>
+      <w:isLgl/>
+      <w:lvlText w:val="%1.%2.%3.%4.%5"/>
+      <w:lvlJc w:val="left"/>
+      <w:pPr>
+        <w:ind w:left="1440" w:hanging="1080"/>
+      </w:pPr>
+      <w:rPr>
+        <w:rFonts w:hint="default"/>
+      </w:rPr>
+    </w:lvl>
+    <w:lvl w:ilvl="5">
+      <w:start w:val="1"/>
+      <w:numFmt w:val="decimal"/>
+      <w:isLgl/>
+      <w:lvlText w:val="%1.%2.%3.%4.%5.%6"/>
+      <w:lvlJc w:val="left"/>
+      <w:pPr>
+        <w:ind w:left="1800" w:hanging="1440"/>
+      </w:pPr>
+      <w:rPr>
+        <w:rFonts w:hint="default"/>
+      </w:rPr>
+    </w:lvl>
+    <w:lvl w:ilvl="6">
+      <w:start w:val="1"/>
+      <w:numFmt w:val="decimal"/>
+      <w:isLgl/>
+      <w:lvlText w:val="%1.%2.%3.%4.%5.%6.%7"/>
+      <w:lvlJc w:val="left"/>
+      <w:pPr>
+        <w:ind w:left="1800" w:hanging="1440"/>
+      </w:pPr>
+      <w:rPr>
+        <w:rFonts w:hint="default"/>
+      </w:rPr>
+    </w:lvl>
+    <w:lvl w:ilvl="7">
+      <w:start w:val="1"/>
+      <w:numFmt w:val="decimal"/>
+      <w:isLgl/>
+      <w:lvlText w:val="%1.%2.%3.%4.%5.%6.%7.%8"/>
+      <w:lvlJc w:val="left"/>
+      <w:pPr>
+        <w:ind w:left="2160" w:hanging="1800"/>
+      </w:pPr>
+      <w:rPr>
+        <w:rFonts w:hint="default"/>
+      </w:rPr>
+    </w:lvl>
+    <w:lvl w:ilvl="8">
+      <w:start w:val="1"/>
+      <w:numFmt w:val="decimal"/>
+      <w:isLgl/>
+      <w:lvlText w:val="%1.%2.%3.%4.%5.%6.%7.%8.%9"/>
+      <w:lvlJc w:val="left"/>
+      <w:pPr>
+        <w:ind w:left="2160" w:hanging="1800"/>
+      </w:pPr>
+      <w:rPr>
+        <w:rFonts w:hint="default"/>
+      </w:rPr>
+    </w:lvl>
+  </w:abstractNum>
+  <w:abstractNum w:abstractNumId="3" w15:restartNumberingAfterBreak="0">
     <w:nsid w:val="7B52576B"/>
     <w:multiLevelType w:val="multilevel"/>
     <w:tmpl w:val="CC960F8C"/>
@@ -825,7 +2179,7 @@
       </w:rPr>
     </w:lvl>
   </w:abstractNum>
-  <w:abstractNum w:abstractNumId="2" w15:restartNumberingAfterBreak="0">
+  <w:abstractNum w:abstractNumId="4" w15:restartNumberingAfterBreak="0">
     <w:nsid w:val="7B610F02"/>
     <w:multiLevelType w:val="multilevel"/>
     <w:tmpl w:val="E2AC8650"/>
@@ -975,13 +2329,19 @@
     </w:lvl>
   </w:abstractNum>
   <w:num w:numId="1" w16cid:durableId="691498307">
-    <w:abstractNumId w:val="2"/>
+    <w:abstractNumId w:val="4"/>
   </w:num>
   <w:num w:numId="2" w16cid:durableId="2050959021">
+    <w:abstractNumId w:val="3"/>
+  </w:num>
+  <w:num w:numId="3" w16cid:durableId="1350714689">
     <w:abstractNumId w:val="1"/>
   </w:num>
-  <w:num w:numId="3" w16cid:durableId="1350714689">
+  <w:num w:numId="4" w16cid:durableId="2124810488">
     <w:abstractNumId w:val="0"/>
+  </w:num>
+  <w:num w:numId="5" w16cid:durableId="441189521">
+    <w:abstractNumId w:val="2"/>
   </w:num>
 </w:numbering>
 </file>
@@ -1414,7 +2774,6 @@
     <w:next w:val="Normal"/>
     <w:link w:val="Heading2Char"/>
     <w:uiPriority w:val="9"/>
-    <w:semiHidden/>
     <w:unhideWhenUsed/>
     <w:qFormat/>
     <w:rsid w:val="00B43ED5"/>
@@ -1437,7 +2796,6 @@
     <w:next w:val="Normal"/>
     <w:link w:val="Heading3Char"/>
     <w:uiPriority w:val="9"/>
-    <w:semiHidden/>
     <w:unhideWhenUsed/>
     <w:qFormat/>
     <w:rsid w:val="00B43ED5"/>
@@ -1631,7 +2989,6 @@
     <w:basedOn w:val="DefaultParagraphFont"/>
     <w:link w:val="Heading2"/>
     <w:uiPriority w:val="9"/>
-    <w:semiHidden/>
     <w:rsid w:val="00B43ED5"/>
     <w:rPr>
       <w:rFonts w:asciiTheme="majorHAnsi" w:eastAsiaTheme="majorEastAsia" w:hAnsiTheme="majorHAnsi" w:cstheme="majorBidi"/>
@@ -1645,7 +3002,6 @@
     <w:basedOn w:val="DefaultParagraphFont"/>
     <w:link w:val="Heading3"/>
     <w:uiPriority w:val="9"/>
-    <w:semiHidden/>
     <w:rsid w:val="00B43ED5"/>
     <w:rPr>
       <w:rFonts w:eastAsiaTheme="majorEastAsia" w:cstheme="majorBidi"/>
@@ -1902,6 +3258,25 @@
       <w:color w:val="0F4761" w:themeColor="accent1" w:themeShade="BF"/>
       <w:spacing w:val="5"/>
     </w:rPr>
+  </w:style>
+  <w:style w:type="table" w:styleId="TableGrid">
+    <w:name w:val="Table Grid"/>
+    <w:basedOn w:val="TableNormal"/>
+    <w:uiPriority w:val="39"/>
+    <w:rsid w:val="005D493A"/>
+    <w:pPr>
+      <w:spacing w:after="0" w:line="240" w:lineRule="auto"/>
+    </w:pPr>
+    <w:tblPr>
+      <w:tblBorders>
+        <w:top w:val="single" w:sz="4" w:space="0" w:color="auto"/>
+        <w:left w:val="single" w:sz="4" w:space="0" w:color="auto"/>
+        <w:bottom w:val="single" w:sz="4" w:space="0" w:color="auto"/>
+        <w:right w:val="single" w:sz="4" w:space="0" w:color="auto"/>
+        <w:insideH w:val="single" w:sz="4" w:space="0" w:color="auto"/>
+        <w:insideV w:val="single" w:sz="4" w:space="0" w:color="auto"/>
+      </w:tblBorders>
+    </w:tblPr>
   </w:style>
 </w:styles>
 </file>

</xml_diff>